<commit_message>
AI materials and obsidian installed
</commit_message>
<xml_diff>
--- a/okruhy.docx
+++ b/okruhy.docx
@@ -54,7 +54,7 @@
       </w:pPr>
       <w:r>
         <w:rPr>
-          <w:rFonts w:eastAsia="Calibri" w:cs="Calibri" w:ascii="Calibri" w:hAnsi="Calibri"/>
+          <w:rFonts w:eastAsia="Calibri" w:cs="Calibri"/>
           <w:b/>
           <w:sz w:val="28"/>
           <w:szCs w:val="28"/>
@@ -64,7 +64,7 @@
       </w:r>
       <w:r>
         <w:rPr>
-          <w:rFonts w:eastAsia="Calibri" w:cs="Calibri" w:ascii="Calibri" w:hAnsi="Calibri"/>
+          <w:rFonts w:eastAsia="Calibri" w:cs="Calibri"/>
           <w:b/>
           <w:spacing w:val="-1"/>
           <w:sz w:val="28"/>
@@ -75,7 +75,7 @@
       </w:r>
       <w:r>
         <w:rPr>
-          <w:rFonts w:eastAsia="Calibri" w:cs="Calibri" w:ascii="Calibri" w:hAnsi="Calibri"/>
+          <w:rFonts w:eastAsia="Calibri" w:cs="Calibri"/>
           <w:b/>
           <w:spacing w:val="1"/>
           <w:sz w:val="28"/>
@@ -86,7 +86,7 @@
       </w:r>
       <w:r>
         <w:rPr>
-          <w:rFonts w:eastAsia="Calibri" w:cs="Calibri" w:ascii="Calibri" w:hAnsi="Calibri"/>
+          <w:rFonts w:eastAsia="Calibri" w:cs="Calibri"/>
           <w:b/>
           <w:sz w:val="28"/>
           <w:szCs w:val="28"/>
@@ -96,7 +96,7 @@
       </w:r>
       <w:r>
         <w:rPr>
-          <w:rFonts w:eastAsia="Calibri" w:cs="Calibri" w:ascii="Calibri" w:hAnsi="Calibri"/>
+          <w:rFonts w:eastAsia="Calibri" w:cs="Calibri"/>
           <w:b/>
           <w:spacing w:val="27"/>
           <w:sz w:val="28"/>
@@ -107,7 +107,7 @@
       </w:r>
       <w:r>
         <w:rPr>
-          <w:rFonts w:eastAsia="Calibri" w:cs="Calibri" w:ascii="Calibri" w:hAnsi="Calibri"/>
+          <w:rFonts w:eastAsia="Calibri" w:cs="Calibri"/>
           <w:b/>
           <w:spacing w:val="1"/>
           <w:sz w:val="28"/>
@@ -118,7 +118,7 @@
       </w:r>
       <w:r>
         <w:rPr>
-          <w:rFonts w:eastAsia="Calibri" w:cs="Calibri" w:ascii="Calibri" w:hAnsi="Calibri"/>
+          <w:rFonts w:eastAsia="Calibri" w:cs="Calibri"/>
           <w:b/>
           <w:sz w:val="28"/>
           <w:szCs w:val="28"/>
@@ -128,7 +128,7 @@
       </w:r>
       <w:r>
         <w:rPr>
-          <w:rFonts w:eastAsia="Calibri" w:cs="Calibri" w:ascii="Calibri" w:hAnsi="Calibri"/>
+          <w:rFonts w:eastAsia="Calibri" w:cs="Calibri"/>
           <w:b/>
           <w:spacing w:val="-2"/>
           <w:sz w:val="28"/>
@@ -139,7 +139,7 @@
       </w:r>
       <w:r>
         <w:rPr>
-          <w:rFonts w:eastAsia="Calibri" w:cs="Calibri" w:ascii="Calibri" w:hAnsi="Calibri"/>
+          <w:rFonts w:eastAsia="Calibri" w:cs="Calibri"/>
           <w:b/>
           <w:spacing w:val="1"/>
           <w:sz w:val="28"/>
@@ -150,7 +150,7 @@
       </w:r>
       <w:r>
         <w:rPr>
-          <w:rFonts w:eastAsia="Calibri" w:cs="Calibri" w:ascii="Calibri" w:hAnsi="Calibri"/>
+          <w:rFonts w:eastAsia="Calibri" w:cs="Calibri"/>
           <w:b/>
           <w:sz w:val="28"/>
           <w:szCs w:val="28"/>
@@ -160,7 +160,7 @@
       </w:r>
       <w:r>
         <w:rPr>
-          <w:rFonts w:eastAsia="Calibri" w:cs="Calibri" w:ascii="Calibri" w:hAnsi="Calibri"/>
+          <w:rFonts w:eastAsia="Calibri" w:cs="Calibri"/>
           <w:b/>
           <w:spacing w:val="20"/>
           <w:sz w:val="28"/>
@@ -171,7 +171,7 @@
       </w:r>
       <w:r>
         <w:rPr>
-          <w:rFonts w:eastAsia="Calibri" w:cs="Calibri" w:ascii="Calibri" w:hAnsi="Calibri"/>
+          <w:rFonts w:eastAsia="Calibri" w:cs="Calibri"/>
           <w:b/>
           <w:spacing w:val="1"/>
           <w:sz w:val="28"/>
@@ -182,7 +182,7 @@
       </w:r>
       <w:r>
         <w:rPr>
-          <w:rFonts w:eastAsia="Calibri" w:cs="Calibri" w:ascii="Calibri" w:hAnsi="Calibri"/>
+          <w:rFonts w:eastAsia="Calibri" w:cs="Calibri"/>
           <w:b/>
           <w:spacing w:val="-2"/>
           <w:sz w:val="28"/>
@@ -193,7 +193,7 @@
       </w:r>
       <w:r>
         <w:rPr>
-          <w:rFonts w:eastAsia="Calibri" w:cs="Calibri" w:ascii="Calibri" w:hAnsi="Calibri"/>
+          <w:rFonts w:eastAsia="Calibri" w:cs="Calibri"/>
           <w:b/>
           <w:spacing w:val="1"/>
           <w:sz w:val="28"/>
@@ -204,7 +204,7 @@
       </w:r>
       <w:r>
         <w:rPr>
-          <w:rFonts w:eastAsia="Calibri" w:cs="Calibri" w:ascii="Calibri" w:hAnsi="Calibri"/>
+          <w:rFonts w:eastAsia="Calibri" w:cs="Calibri"/>
           <w:b/>
           <w:spacing w:val="-1"/>
           <w:sz w:val="28"/>
@@ -215,7 +215,7 @@
       </w:r>
       <w:r>
         <w:rPr>
-          <w:rFonts w:eastAsia="Calibri" w:cs="Calibri" w:ascii="Calibri" w:hAnsi="Calibri"/>
+          <w:rFonts w:eastAsia="Calibri" w:cs="Calibri"/>
           <w:b/>
           <w:spacing w:val="1"/>
           <w:sz w:val="28"/>
@@ -226,7 +226,7 @@
       </w:r>
       <w:r>
         <w:rPr>
-          <w:rFonts w:eastAsia="Calibri" w:cs="Calibri" w:ascii="Calibri" w:hAnsi="Calibri"/>
+          <w:rFonts w:eastAsia="Calibri" w:cs="Calibri"/>
           <w:b/>
           <w:sz w:val="28"/>
           <w:szCs w:val="28"/>
@@ -236,7 +236,7 @@
       </w:r>
       <w:r>
         <w:rPr>
-          <w:rFonts w:eastAsia="Calibri" w:cs="Calibri" w:ascii="Calibri" w:hAnsi="Calibri"/>
+          <w:rFonts w:eastAsia="Calibri" w:cs="Calibri"/>
           <w:b/>
           <w:spacing w:val="-2"/>
           <w:sz w:val="28"/>
@@ -247,7 +247,7 @@
       </w:r>
       <w:r>
         <w:rPr>
-          <w:rFonts w:eastAsia="Calibri" w:cs="Calibri" w:ascii="Calibri" w:hAnsi="Calibri"/>
+          <w:rFonts w:eastAsia="Calibri" w:cs="Calibri"/>
           <w:b/>
           <w:spacing w:val="1"/>
           <w:sz w:val="28"/>
@@ -258,7 +258,7 @@
       </w:r>
       <w:r>
         <w:rPr>
-          <w:rFonts w:eastAsia="Calibri" w:cs="Calibri" w:ascii="Calibri" w:hAnsi="Calibri"/>
+          <w:rFonts w:eastAsia="Calibri" w:cs="Calibri"/>
           <w:b/>
           <w:sz w:val="28"/>
           <w:szCs w:val="28"/>
@@ -268,7 +268,7 @@
       </w:r>
       <w:r>
         <w:rPr>
-          <w:rFonts w:eastAsia="Calibri" w:cs="Calibri" w:ascii="Calibri" w:hAnsi="Calibri"/>
+          <w:rFonts w:eastAsia="Calibri" w:cs="Calibri"/>
           <w:b/>
           <w:spacing w:val="-3"/>
           <w:sz w:val="28"/>
@@ -279,7 +279,7 @@
       </w:r>
       <w:r>
         <w:rPr>
-          <w:rFonts w:eastAsia="Calibri" w:cs="Calibri" w:ascii="Calibri" w:hAnsi="Calibri"/>
+          <w:rFonts w:eastAsia="Calibri" w:cs="Calibri"/>
           <w:b/>
           <w:sz w:val="28"/>
           <w:szCs w:val="28"/>
@@ -289,7 +289,7 @@
       </w:r>
       <w:r>
         <w:rPr>
-          <w:rFonts w:eastAsia="Calibri" w:cs="Calibri" w:ascii="Calibri" w:hAnsi="Calibri"/>
+          <w:rFonts w:eastAsia="Calibri" w:cs="Calibri"/>
           <w:b/>
           <w:spacing w:val="38"/>
           <w:sz w:val="28"/>
@@ -300,7 +300,7 @@
       </w:r>
       <w:r>
         <w:rPr>
-          <w:rFonts w:eastAsia="Calibri" w:cs="Calibri" w:ascii="Calibri" w:hAnsi="Calibri"/>
+          <w:rFonts w:eastAsia="Calibri" w:cs="Calibri"/>
           <w:b/>
           <w:spacing w:val="1"/>
           <w:w w:val="104"/>
@@ -312,7 +312,7 @@
       </w:r>
       <w:r>
         <w:rPr>
-          <w:rFonts w:eastAsia="Calibri" w:cs="Calibri" w:ascii="Calibri" w:hAnsi="Calibri"/>
+          <w:rFonts w:eastAsia="Calibri" w:cs="Calibri"/>
           <w:b/>
           <w:spacing w:val="1"/>
           <w:w w:val="107"/>
@@ -324,7 +324,7 @@
       </w:r>
       <w:r>
         <w:rPr>
-          <w:rFonts w:eastAsia="Calibri" w:cs="Calibri" w:ascii="Calibri" w:hAnsi="Calibri"/>
+          <w:rFonts w:eastAsia="Calibri" w:cs="Calibri"/>
           <w:b/>
           <w:spacing w:val="-2"/>
           <w:w w:val="102"/>
@@ -336,7 +336,7 @@
       </w:r>
       <w:r>
         <w:rPr>
-          <w:rFonts w:eastAsia="Calibri" w:cs="Calibri" w:ascii="Calibri" w:hAnsi="Calibri"/>
+          <w:rFonts w:eastAsia="Calibri" w:cs="Calibri"/>
           <w:b/>
           <w:spacing w:val="1"/>
           <w:w w:val="107"/>
@@ -348,7 +348,7 @@
       </w:r>
       <w:r>
         <w:rPr>
-          <w:rFonts w:eastAsia="Calibri" w:cs="Calibri" w:ascii="Calibri" w:hAnsi="Calibri"/>
+          <w:rFonts w:eastAsia="Calibri" w:cs="Calibri"/>
           <w:b/>
           <w:spacing w:val="1"/>
           <w:w w:val="103"/>
@@ -360,7 +360,7 @@
       </w:r>
       <w:r>
         <w:rPr>
-          <w:rFonts w:eastAsia="Calibri" w:cs="Calibri" w:ascii="Calibri" w:hAnsi="Calibri"/>
+          <w:rFonts w:eastAsia="Calibri" w:cs="Calibri"/>
           <w:b/>
           <w:spacing w:val="-1"/>
           <w:w w:val="104"/>
@@ -372,7 +372,7 @@
       </w:r>
       <w:r>
         <w:rPr>
-          <w:rFonts w:eastAsia="Calibri" w:cs="Calibri" w:ascii="Calibri" w:hAnsi="Calibri"/>
+          <w:rFonts w:eastAsia="Calibri" w:cs="Calibri"/>
           <w:b/>
           <w:w w:val="103"/>
           <w:sz w:val="28"/>
@@ -418,7 +418,7 @@
       </w:pPr>
       <w:r>
         <w:rPr>
-          <w:rFonts w:eastAsia="Calibri" w:cs="Calibri" w:ascii="Calibri" w:hAnsi="Calibri"/>
+          <w:rFonts w:eastAsia="Calibri" w:cs="Calibri"/>
           <w:b/>
           <w:sz w:val="28"/>
           <w:szCs w:val="28"/>
@@ -428,7 +428,7 @@
       </w:r>
       <w:r>
         <w:rPr>
-          <w:rFonts w:eastAsia="Calibri" w:cs="Calibri" w:ascii="Calibri" w:hAnsi="Calibri"/>
+          <w:rFonts w:eastAsia="Calibri" w:cs="Calibri"/>
           <w:b/>
           <w:spacing w:val="1"/>
           <w:sz w:val="28"/>
@@ -439,7 +439,7 @@
       </w:r>
       <w:r>
         <w:rPr>
-          <w:rFonts w:eastAsia="Calibri" w:cs="Calibri" w:ascii="Calibri" w:hAnsi="Calibri"/>
+          <w:rFonts w:eastAsia="Calibri" w:cs="Calibri"/>
           <w:b/>
           <w:spacing w:val="-2"/>
           <w:sz w:val="28"/>
@@ -450,7 +450,7 @@
       </w:r>
       <w:r>
         <w:rPr>
-          <w:rFonts w:eastAsia="Calibri" w:cs="Calibri" w:ascii="Calibri" w:hAnsi="Calibri"/>
+          <w:rFonts w:eastAsia="Calibri" w:cs="Calibri"/>
           <w:b/>
           <w:spacing w:val="1"/>
           <w:sz w:val="28"/>
@@ -461,7 +461,7 @@
       </w:r>
       <w:r>
         <w:rPr>
-          <w:rFonts w:eastAsia="Calibri" w:cs="Calibri" w:ascii="Calibri" w:hAnsi="Calibri"/>
+          <w:rFonts w:eastAsia="Calibri" w:cs="Calibri"/>
           <w:b/>
           <w:spacing w:val="-1"/>
           <w:sz w:val="28"/>
@@ -472,7 +472,7 @@
       </w:r>
       <w:r>
         <w:rPr>
-          <w:rFonts w:eastAsia="Calibri" w:cs="Calibri" w:ascii="Calibri" w:hAnsi="Calibri"/>
+          <w:rFonts w:eastAsia="Calibri" w:cs="Calibri"/>
           <w:b/>
           <w:sz w:val="28"/>
           <w:szCs w:val="28"/>
@@ -482,7 +482,7 @@
       </w:r>
       <w:r>
         <w:rPr>
-          <w:rFonts w:eastAsia="Calibri" w:cs="Calibri" w:ascii="Calibri" w:hAnsi="Calibri"/>
+          <w:rFonts w:eastAsia="Calibri" w:cs="Calibri"/>
           <w:b/>
           <w:spacing w:val="24"/>
           <w:sz w:val="28"/>
@@ -493,7 +493,7 @@
       </w:r>
       <w:r>
         <w:rPr>
-          <w:rFonts w:eastAsia="Calibri" w:cs="Calibri" w:ascii="Calibri" w:hAnsi="Calibri"/>
+          <w:rFonts w:eastAsia="Calibri" w:cs="Calibri"/>
           <w:b/>
           <w:sz w:val="28"/>
           <w:szCs w:val="28"/>
@@ -538,7 +538,7 @@
       </w:pPr>
       <w:r>
         <w:rPr>
-          <w:rFonts w:eastAsia="Calibri" w:cs="Calibri" w:ascii="Calibri" w:hAnsi="Calibri"/>
+          <w:rFonts w:eastAsia="Calibri" w:cs="Calibri"/>
           <w:b/>
           <w:sz w:val="32"/>
           <w:szCs w:val="32"/>
@@ -548,7 +548,7 @@
       </w:r>
       <w:r>
         <w:rPr>
-          <w:rFonts w:eastAsia="Calibri" w:cs="Calibri" w:ascii="Calibri" w:hAnsi="Calibri"/>
+          <w:rFonts w:eastAsia="Calibri" w:cs="Calibri"/>
           <w:b/>
           <w:spacing w:val="1"/>
           <w:sz w:val="32"/>
@@ -559,7 +559,7 @@
       </w:r>
       <w:r>
         <w:rPr>
-          <w:rFonts w:eastAsia="Calibri" w:cs="Calibri" w:ascii="Calibri" w:hAnsi="Calibri"/>
+          <w:rFonts w:eastAsia="Calibri" w:cs="Calibri"/>
           <w:b/>
           <w:sz w:val="32"/>
           <w:szCs w:val="32"/>
@@ -569,7 +569,7 @@
       </w:r>
       <w:r>
         <w:rPr>
-          <w:rFonts w:eastAsia="Calibri" w:cs="Calibri" w:ascii="Calibri" w:hAnsi="Calibri"/>
+          <w:rFonts w:eastAsia="Calibri" w:cs="Calibri"/>
           <w:b/>
           <w:spacing w:val="1"/>
           <w:sz w:val="32"/>
@@ -580,7 +580,7 @@
       </w:r>
       <w:r>
         <w:rPr>
-          <w:rFonts w:eastAsia="Calibri" w:cs="Calibri" w:ascii="Calibri" w:hAnsi="Calibri"/>
+          <w:rFonts w:eastAsia="Calibri" w:cs="Calibri"/>
           <w:b/>
           <w:sz w:val="32"/>
           <w:szCs w:val="32"/>
@@ -590,7 +590,7 @@
       </w:r>
       <w:r>
         <w:rPr>
-          <w:rFonts w:eastAsia="Calibri" w:cs="Calibri" w:ascii="Calibri" w:hAnsi="Calibri"/>
+          <w:rFonts w:eastAsia="Calibri" w:cs="Calibri"/>
           <w:b/>
           <w:spacing w:val="19"/>
           <w:sz w:val="32"/>
@@ -601,7 +601,7 @@
       </w:r>
       <w:r>
         <w:rPr>
-          <w:rFonts w:eastAsia="Calibri" w:cs="Calibri" w:ascii="Calibri" w:hAnsi="Calibri"/>
+          <w:rFonts w:eastAsia="Calibri" w:cs="Calibri"/>
           <w:b/>
           <w:spacing w:val="1"/>
           <w:sz w:val="32"/>
@@ -612,7 +612,7 @@
       </w:r>
       <w:r>
         <w:rPr>
-          <w:rFonts w:eastAsia="Calibri" w:cs="Calibri" w:ascii="Calibri" w:hAnsi="Calibri"/>
+          <w:rFonts w:eastAsia="Calibri" w:cs="Calibri"/>
           <w:b/>
           <w:sz w:val="32"/>
           <w:szCs w:val="32"/>
@@ -622,7 +622,7 @@
       </w:r>
       <w:r>
         <w:rPr>
-          <w:rFonts w:eastAsia="Calibri" w:cs="Calibri" w:ascii="Calibri" w:hAnsi="Calibri"/>
+          <w:rFonts w:eastAsia="Calibri" w:cs="Calibri"/>
           <w:b/>
           <w:spacing w:val="-1"/>
           <w:sz w:val="32"/>
@@ -633,7 +633,7 @@
       </w:r>
       <w:r>
         <w:rPr>
-          <w:rFonts w:eastAsia="Calibri" w:cs="Calibri" w:ascii="Calibri" w:hAnsi="Calibri"/>
+          <w:rFonts w:eastAsia="Calibri" w:cs="Calibri"/>
           <w:b/>
           <w:spacing w:val="2"/>
           <w:sz w:val="32"/>
@@ -644,7 +644,7 @@
       </w:r>
       <w:r>
         <w:rPr>
-          <w:rFonts w:eastAsia="Calibri" w:cs="Calibri" w:ascii="Calibri" w:hAnsi="Calibri"/>
+          <w:rFonts w:eastAsia="Calibri" w:cs="Calibri"/>
           <w:b/>
           <w:spacing w:val="-1"/>
           <w:sz w:val="32"/>
@@ -655,7 +655,7 @@
       </w:r>
       <w:r>
         <w:rPr>
-          <w:rFonts w:eastAsia="Calibri" w:cs="Calibri" w:ascii="Calibri" w:hAnsi="Calibri"/>
+          <w:rFonts w:eastAsia="Calibri" w:cs="Calibri"/>
           <w:b/>
           <w:sz w:val="32"/>
           <w:szCs w:val="32"/>
@@ -665,7 +665,7 @@
       </w:r>
       <w:r>
         <w:rPr>
-          <w:rFonts w:eastAsia="Calibri" w:cs="Calibri" w:ascii="Calibri" w:hAnsi="Calibri"/>
+          <w:rFonts w:eastAsia="Calibri" w:cs="Calibri"/>
           <w:b/>
           <w:spacing w:val="21"/>
           <w:sz w:val="32"/>
@@ -676,7 +676,7 @@
       </w:r>
       <w:r>
         <w:rPr>
-          <w:rFonts w:eastAsia="Calibri" w:cs="Calibri" w:ascii="Calibri" w:hAnsi="Calibri"/>
+          <w:rFonts w:eastAsia="Calibri" w:cs="Calibri"/>
           <w:b/>
           <w:spacing w:val="-1"/>
           <w:sz w:val="32"/>
@@ -687,7 +687,7 @@
       </w:r>
       <w:r>
         <w:rPr>
-          <w:rFonts w:eastAsia="Calibri" w:cs="Calibri" w:ascii="Calibri" w:hAnsi="Calibri"/>
+          <w:rFonts w:eastAsia="Calibri" w:cs="Calibri"/>
           <w:b/>
           <w:sz w:val="32"/>
           <w:szCs w:val="32"/>
@@ -697,7 +697,7 @@
       </w:r>
       <w:r>
         <w:rPr>
-          <w:rFonts w:eastAsia="Calibri" w:cs="Calibri" w:ascii="Calibri" w:hAnsi="Calibri"/>
+          <w:rFonts w:eastAsia="Calibri" w:cs="Calibri"/>
           <w:b/>
           <w:spacing w:val="5"/>
           <w:sz w:val="32"/>
@@ -708,7 +708,7 @@
       </w:r>
       <w:r>
         <w:rPr>
-          <w:rFonts w:eastAsia="Calibri" w:cs="Calibri" w:ascii="Calibri" w:hAnsi="Calibri"/>
+          <w:rFonts w:eastAsia="Calibri" w:cs="Calibri"/>
           <w:b/>
           <w:sz w:val="32"/>
           <w:szCs w:val="32"/>
@@ -718,7 +718,7 @@
       </w:r>
       <w:r>
         <w:rPr>
-          <w:rFonts w:eastAsia="Calibri" w:cs="Calibri" w:ascii="Calibri" w:hAnsi="Calibri"/>
+          <w:rFonts w:eastAsia="Calibri" w:cs="Calibri"/>
           <w:b/>
           <w:spacing w:val="1"/>
           <w:sz w:val="32"/>
@@ -729,7 +729,7 @@
       </w:r>
       <w:r>
         <w:rPr>
-          <w:rFonts w:eastAsia="Calibri" w:cs="Calibri" w:ascii="Calibri" w:hAnsi="Calibri"/>
+          <w:rFonts w:eastAsia="Calibri" w:cs="Calibri"/>
           <w:b/>
           <w:spacing w:val="2"/>
           <w:sz w:val="32"/>
@@ -740,7 +740,7 @@
       </w:r>
       <w:r>
         <w:rPr>
-          <w:rFonts w:eastAsia="Calibri" w:cs="Calibri" w:ascii="Calibri" w:hAnsi="Calibri"/>
+          <w:rFonts w:eastAsia="Calibri" w:cs="Calibri"/>
           <w:b/>
           <w:spacing w:val="-1"/>
           <w:sz w:val="32"/>
@@ -751,7 +751,7 @@
       </w:r>
       <w:r>
         <w:rPr>
-          <w:rFonts w:eastAsia="Calibri" w:cs="Calibri" w:ascii="Calibri" w:hAnsi="Calibri"/>
+          <w:rFonts w:eastAsia="Calibri" w:cs="Calibri"/>
           <w:b/>
           <w:sz w:val="32"/>
           <w:szCs w:val="32"/>
@@ -761,7 +761,7 @@
       </w:r>
       <w:r>
         <w:rPr>
-          <w:rFonts w:eastAsia="Calibri" w:cs="Calibri" w:ascii="Calibri" w:hAnsi="Calibri"/>
+          <w:rFonts w:eastAsia="Calibri" w:cs="Calibri"/>
           <w:b/>
           <w:spacing w:val="17"/>
           <w:sz w:val="32"/>
@@ -772,7 +772,7 @@
       </w:r>
       <w:r>
         <w:rPr>
-          <w:rFonts w:eastAsia="Calibri" w:cs="Calibri" w:ascii="Calibri" w:hAnsi="Calibri"/>
+          <w:rFonts w:eastAsia="Calibri" w:cs="Calibri"/>
           <w:b/>
           <w:sz w:val="32"/>
           <w:szCs w:val="32"/>
@@ -782,7 +782,7 @@
       </w:r>
       <w:r>
         <w:rPr>
-          <w:rFonts w:eastAsia="Calibri" w:cs="Calibri" w:ascii="Calibri" w:hAnsi="Calibri"/>
+          <w:rFonts w:eastAsia="Calibri" w:cs="Calibri"/>
           <w:b/>
           <w:spacing w:val="1"/>
           <w:sz w:val="32"/>
@@ -793,7 +793,7 @@
       </w:r>
       <w:r>
         <w:rPr>
-          <w:rFonts w:eastAsia="Calibri" w:cs="Calibri" w:ascii="Calibri" w:hAnsi="Calibri"/>
+          <w:rFonts w:eastAsia="Calibri" w:cs="Calibri"/>
           <w:b/>
           <w:sz w:val="32"/>
           <w:szCs w:val="32"/>
@@ -803,7 +803,7 @@
       </w:r>
       <w:r>
         <w:rPr>
-          <w:rFonts w:eastAsia="Calibri" w:cs="Calibri" w:ascii="Calibri" w:hAnsi="Calibri"/>
+          <w:rFonts w:eastAsia="Calibri" w:cs="Calibri"/>
           <w:b/>
           <w:spacing w:val="-1"/>
           <w:sz w:val="32"/>
@@ -814,7 +814,7 @@
       </w:r>
       <w:r>
         <w:rPr>
-          <w:rFonts w:eastAsia="Calibri" w:cs="Calibri" w:ascii="Calibri" w:hAnsi="Calibri"/>
+          <w:rFonts w:eastAsia="Calibri" w:cs="Calibri"/>
           <w:b/>
           <w:sz w:val="32"/>
           <w:szCs w:val="32"/>
@@ -824,7 +824,7 @@
       </w:r>
       <w:r>
         <w:rPr>
-          <w:rFonts w:eastAsia="Calibri" w:cs="Calibri" w:ascii="Calibri" w:hAnsi="Calibri"/>
+          <w:rFonts w:eastAsia="Calibri" w:cs="Calibri"/>
           <w:b/>
           <w:spacing w:val="3"/>
           <w:sz w:val="32"/>
@@ -835,7 +835,7 @@
       </w:r>
       <w:r>
         <w:rPr>
-          <w:rFonts w:eastAsia="Calibri" w:cs="Calibri" w:ascii="Calibri" w:hAnsi="Calibri"/>
+          <w:rFonts w:eastAsia="Calibri" w:cs="Calibri"/>
           <w:b/>
           <w:spacing w:val="-1"/>
           <w:sz w:val="32"/>
@@ -846,7 +846,7 @@
       </w:r>
       <w:r>
         <w:rPr>
-          <w:rFonts w:eastAsia="Calibri" w:cs="Calibri" w:ascii="Calibri" w:hAnsi="Calibri"/>
+          <w:rFonts w:eastAsia="Calibri" w:cs="Calibri"/>
           <w:b/>
           <w:sz w:val="32"/>
           <w:szCs w:val="32"/>
@@ -856,7 +856,7 @@
       </w:r>
       <w:r>
         <w:rPr>
-          <w:rFonts w:eastAsia="Calibri" w:cs="Calibri" w:ascii="Calibri" w:hAnsi="Calibri"/>
+          <w:rFonts w:eastAsia="Calibri" w:cs="Calibri"/>
           <w:b/>
           <w:spacing w:val="9"/>
           <w:sz w:val="32"/>
@@ -867,7 +867,7 @@
       </w:r>
       <w:r>
         <w:rPr>
-          <w:rFonts w:eastAsia="Calibri" w:cs="Calibri" w:ascii="Calibri" w:hAnsi="Calibri"/>
+          <w:rFonts w:eastAsia="Calibri" w:cs="Calibri"/>
           <w:b/>
           <w:sz w:val="32"/>
           <w:szCs w:val="32"/>
@@ -877,7 +877,7 @@
       </w:r>
       <w:r>
         <w:rPr>
-          <w:rFonts w:eastAsia="Calibri" w:cs="Calibri" w:ascii="Calibri" w:hAnsi="Calibri"/>
+          <w:rFonts w:eastAsia="Calibri" w:cs="Calibri"/>
           <w:b/>
           <w:spacing w:val="1"/>
           <w:sz w:val="32"/>
@@ -888,7 +888,7 @@
       </w:r>
       <w:r>
         <w:rPr>
-          <w:rFonts w:eastAsia="Calibri" w:cs="Calibri" w:ascii="Calibri" w:hAnsi="Calibri"/>
+          <w:rFonts w:eastAsia="Calibri" w:cs="Calibri"/>
           <w:b/>
           <w:spacing w:val="-1"/>
           <w:sz w:val="32"/>
@@ -899,7 +899,7 @@
       </w:r>
       <w:r>
         <w:rPr>
-          <w:rFonts w:eastAsia="Calibri" w:cs="Calibri" w:ascii="Calibri" w:hAnsi="Calibri"/>
+          <w:rFonts w:eastAsia="Calibri" w:cs="Calibri"/>
           <w:b/>
           <w:sz w:val="32"/>
           <w:szCs w:val="32"/>
@@ -909,7 +909,7 @@
       </w:r>
       <w:r>
         <w:rPr>
-          <w:rFonts w:eastAsia="Calibri" w:cs="Calibri" w:ascii="Calibri" w:hAnsi="Calibri"/>
+          <w:rFonts w:eastAsia="Calibri" w:cs="Calibri"/>
           <w:b/>
           <w:spacing w:val="27"/>
           <w:sz w:val="32"/>
@@ -920,7 +920,7 @@
       </w:r>
       <w:r>
         <w:rPr>
-          <w:rFonts w:eastAsia="Calibri" w:cs="Calibri" w:ascii="Calibri" w:hAnsi="Calibri"/>
+          <w:rFonts w:eastAsia="Calibri" w:cs="Calibri"/>
           <w:b/>
           <w:spacing w:val="1"/>
           <w:w w:val="101"/>
@@ -932,7 +932,7 @@
       </w:r>
       <w:r>
         <w:rPr>
-          <w:rFonts w:eastAsia="Calibri" w:cs="Calibri" w:ascii="Calibri" w:hAnsi="Calibri"/>
+          <w:rFonts w:eastAsia="Calibri" w:cs="Calibri"/>
           <w:b/>
           <w:spacing w:val="-1"/>
           <w:w w:val="101"/>
@@ -944,7 +944,7 @@
       </w:r>
       <w:r>
         <w:rPr>
-          <w:rFonts w:eastAsia="Calibri" w:cs="Calibri" w:ascii="Calibri" w:hAnsi="Calibri"/>
+          <w:rFonts w:eastAsia="Calibri" w:cs="Calibri"/>
           <w:b/>
           <w:spacing w:val="1"/>
           <w:w w:val="101"/>
@@ -956,7 +956,7 @@
       </w:r>
       <w:r>
         <w:rPr>
-          <w:rFonts w:eastAsia="Calibri" w:cs="Calibri" w:ascii="Calibri" w:hAnsi="Calibri"/>
+          <w:rFonts w:eastAsia="Calibri" w:cs="Calibri"/>
           <w:b/>
           <w:spacing w:val="-1"/>
           <w:w w:val="101"/>
@@ -968,7 +968,7 @@
       </w:r>
       <w:r>
         <w:rPr>
-          <w:rFonts w:eastAsia="Calibri" w:cs="Calibri" w:ascii="Calibri" w:hAnsi="Calibri"/>
+          <w:rFonts w:eastAsia="Calibri" w:cs="Calibri"/>
           <w:b/>
           <w:w w:val="101"/>
           <w:sz w:val="32"/>
@@ -1014,7 +1014,7 @@
       </w:pPr>
       <w:r>
         <w:rPr>
-          <w:rFonts w:eastAsia="Calibri" w:cs="Calibri" w:ascii="Calibri" w:hAnsi="Calibri"/>
+          <w:rFonts w:eastAsia="Calibri" w:cs="Calibri"/>
           <w:b/>
           <w:sz w:val="36"/>
           <w:szCs w:val="36"/>
@@ -1024,7 +1024,7 @@
       </w:r>
       <w:r>
         <w:rPr>
-          <w:rFonts w:eastAsia="Calibri" w:cs="Calibri" w:ascii="Calibri" w:hAnsi="Calibri"/>
+          <w:rFonts w:eastAsia="Calibri" w:cs="Calibri"/>
           <w:b/>
           <w:spacing w:val="1"/>
           <w:sz w:val="36"/>
@@ -1035,7 +1035,7 @@
       </w:r>
       <w:r>
         <w:rPr>
-          <w:rFonts w:eastAsia="Calibri" w:cs="Calibri" w:ascii="Calibri" w:hAnsi="Calibri"/>
+          <w:rFonts w:eastAsia="Calibri" w:cs="Calibri"/>
           <w:b/>
           <w:sz w:val="36"/>
           <w:szCs w:val="36"/>
@@ -1045,7 +1045,7 @@
       </w:r>
       <w:r>
         <w:rPr>
-          <w:rFonts w:eastAsia="Calibri" w:cs="Calibri" w:ascii="Calibri" w:hAnsi="Calibri"/>
+          <w:rFonts w:eastAsia="Calibri" w:cs="Calibri"/>
           <w:b/>
           <w:spacing w:val="1"/>
           <w:sz w:val="36"/>
@@ -1056,7 +1056,7 @@
       </w:r>
       <w:r>
         <w:rPr>
-          <w:rFonts w:eastAsia="Calibri" w:cs="Calibri" w:ascii="Calibri" w:hAnsi="Calibri"/>
+          <w:rFonts w:eastAsia="Calibri" w:cs="Calibri"/>
           <w:b/>
           <w:sz w:val="36"/>
           <w:szCs w:val="36"/>
@@ -1066,7 +1066,7 @@
       </w:r>
       <w:r>
         <w:rPr>
-          <w:rFonts w:eastAsia="Calibri" w:cs="Calibri" w:ascii="Calibri" w:hAnsi="Calibri"/>
+          <w:rFonts w:eastAsia="Calibri" w:cs="Calibri"/>
           <w:b/>
           <w:spacing w:val="-2"/>
           <w:sz w:val="36"/>
@@ -1077,7 +1077,7 @@
       </w:r>
       <w:r>
         <w:rPr>
-          <w:rFonts w:eastAsia="Calibri" w:cs="Calibri" w:ascii="Calibri" w:hAnsi="Calibri"/>
+          <w:rFonts w:eastAsia="Calibri" w:cs="Calibri"/>
           <w:b/>
           <w:spacing w:val="1"/>
           <w:sz w:val="36"/>
@@ -1088,7 +1088,7 @@
       </w:r>
       <w:r>
         <w:rPr>
-          <w:rFonts w:eastAsia="Calibri" w:cs="Calibri" w:ascii="Calibri" w:hAnsi="Calibri"/>
+          <w:rFonts w:eastAsia="Calibri" w:cs="Calibri"/>
           <w:b/>
           <w:sz w:val="36"/>
           <w:szCs w:val="36"/>
@@ -1098,7 +1098,7 @@
       </w:r>
       <w:r>
         <w:rPr>
-          <w:rFonts w:eastAsia="Calibri" w:cs="Calibri" w:ascii="Calibri" w:hAnsi="Calibri"/>
+          <w:rFonts w:eastAsia="Calibri" w:cs="Calibri"/>
           <w:b/>
           <w:spacing w:val="51"/>
           <w:sz w:val="36"/>
@@ -1109,7 +1109,7 @@
       </w:r>
       <w:r>
         <w:rPr>
-          <w:rFonts w:eastAsia="Calibri" w:cs="Calibri" w:ascii="Calibri" w:hAnsi="Calibri"/>
+          <w:rFonts w:eastAsia="Calibri" w:cs="Calibri"/>
           <w:b/>
           <w:spacing w:val="1"/>
           <w:w w:val="107"/>
@@ -1121,7 +1121,7 @@
       </w:r>
       <w:r>
         <w:rPr>
-          <w:rFonts w:eastAsia="Calibri" w:cs="Calibri" w:ascii="Calibri" w:hAnsi="Calibri"/>
+          <w:rFonts w:eastAsia="Calibri" w:cs="Calibri"/>
           <w:b/>
           <w:spacing w:val="1"/>
           <w:w w:val="102"/>
@@ -1133,7 +1133,7 @@
       </w:r>
       <w:r>
         <w:rPr>
-          <w:rFonts w:eastAsia="Calibri" w:cs="Calibri" w:ascii="Calibri" w:hAnsi="Calibri"/>
+          <w:rFonts w:eastAsia="Calibri" w:cs="Calibri"/>
           <w:b/>
           <w:spacing w:val="-1"/>
           <w:w w:val="103"/>
@@ -1145,7 +1145,7 @@
       </w:r>
       <w:r>
         <w:rPr>
-          <w:rFonts w:eastAsia="Calibri" w:cs="Calibri" w:ascii="Calibri" w:hAnsi="Calibri"/>
+          <w:rFonts w:eastAsia="Calibri" w:cs="Calibri"/>
           <w:b/>
           <w:spacing w:val="-1"/>
           <w:w w:val="101"/>
@@ -1157,7 +1157,7 @@
       </w:r>
       <w:r>
         <w:rPr>
-          <w:rFonts w:eastAsia="Calibri" w:cs="Calibri" w:ascii="Calibri" w:hAnsi="Calibri"/>
+          <w:rFonts w:eastAsia="Calibri" w:cs="Calibri"/>
           <w:b/>
           <w:w w:val="101"/>
           <w:sz w:val="36"/>
@@ -1168,7 +1168,7 @@
       </w:r>
       <w:r>
         <w:rPr>
-          <w:rFonts w:eastAsia="Calibri" w:cs="Calibri" w:ascii="Calibri" w:hAnsi="Calibri"/>
+          <w:rFonts w:eastAsia="Calibri" w:cs="Calibri"/>
           <w:b/>
           <w:w w:val="102"/>
           <w:sz w:val="36"/>
@@ -1179,7 +1179,7 @@
       </w:r>
       <w:r>
         <w:rPr>
-          <w:rFonts w:eastAsia="Calibri" w:cs="Calibri" w:ascii="Calibri" w:hAnsi="Calibri"/>
+          <w:rFonts w:eastAsia="Calibri" w:cs="Calibri"/>
           <w:b/>
           <w:w w:val="103"/>
           <w:sz w:val="36"/>
@@ -1190,7 +1190,7 @@
       </w:r>
       <w:r>
         <w:rPr>
-          <w:rFonts w:eastAsia="Calibri" w:cs="Calibri" w:ascii="Calibri" w:hAnsi="Calibri"/>
+          <w:rFonts w:eastAsia="Calibri" w:cs="Calibri"/>
           <w:b/>
           <w:spacing w:val="1"/>
           <w:w w:val="107"/>
@@ -1202,7 +1202,7 @@
       </w:r>
       <w:r>
         <w:rPr>
-          <w:rFonts w:eastAsia="Calibri" w:cs="Calibri" w:ascii="Calibri" w:hAnsi="Calibri"/>
+          <w:rFonts w:eastAsia="Calibri" w:cs="Calibri"/>
           <w:b/>
           <w:w w:val="105"/>
           <w:sz w:val="36"/>
@@ -1213,7 +1213,7 @@
       </w:r>
       <w:r>
         <w:rPr>
-          <w:rFonts w:eastAsia="Calibri" w:cs="Calibri" w:ascii="Calibri" w:hAnsi="Calibri"/>
+          <w:rFonts w:eastAsia="Calibri" w:cs="Calibri"/>
           <w:b/>
           <w:w w:val="102"/>
           <w:sz w:val="36"/>
@@ -1317,7 +1317,7 @@
       </w:pPr>
       <w:r>
         <w:rPr>
-          <w:rFonts w:eastAsia="Calibri" w:cs="Calibri" w:ascii="Calibri" w:hAnsi="Calibri"/>
+          <w:rFonts w:eastAsia="Calibri" w:cs="Calibri"/>
           <w:b/>
           <w:spacing w:val="1"/>
           <w:lang w:val="cs-CZ"/>
@@ -1326,7 +1326,7 @@
       </w:r>
       <w:r>
         <w:rPr>
-          <w:rFonts w:eastAsia="Calibri" w:cs="Calibri" w:ascii="Calibri" w:hAnsi="Calibri"/>
+          <w:rFonts w:eastAsia="Calibri" w:cs="Calibri"/>
           <w:b/>
           <w:lang w:val="cs-CZ"/>
         </w:rPr>
@@ -1334,7 +1334,7 @@
       </w:r>
       <w:r>
         <w:rPr>
-          <w:rFonts w:eastAsia="Calibri" w:cs="Calibri" w:ascii="Calibri" w:hAnsi="Calibri"/>
+          <w:rFonts w:eastAsia="Calibri" w:cs="Calibri"/>
           <w:b/>
           <w:spacing w:val="-1"/>
           <w:lang w:val="cs-CZ"/>
@@ -1343,7 +1343,7 @@
       </w:r>
       <w:r>
         <w:rPr>
-          <w:rFonts w:eastAsia="Calibri" w:cs="Calibri" w:ascii="Calibri" w:hAnsi="Calibri"/>
+          <w:rFonts w:eastAsia="Calibri" w:cs="Calibri"/>
           <w:b/>
           <w:lang w:val="cs-CZ"/>
         </w:rPr>
@@ -1351,7 +1351,7 @@
       </w:r>
       <w:r>
         <w:rPr>
-          <w:rFonts w:eastAsia="Calibri" w:cs="Calibri" w:ascii="Calibri" w:hAnsi="Calibri"/>
+          <w:rFonts w:eastAsia="Calibri" w:cs="Calibri"/>
           <w:b/>
           <w:spacing w:val="1"/>
           <w:lang w:val="cs-CZ"/>
@@ -1360,7 +1360,7 @@
       </w:r>
       <w:r>
         <w:rPr>
-          <w:rFonts w:eastAsia="Calibri" w:cs="Calibri" w:ascii="Calibri" w:hAnsi="Calibri"/>
+          <w:rFonts w:eastAsia="Calibri" w:cs="Calibri"/>
           <w:b/>
           <w:spacing w:val="-1"/>
           <w:lang w:val="cs-CZ"/>
@@ -1369,7 +1369,7 @@
       </w:r>
       <w:r>
         <w:rPr>
-          <w:rFonts w:eastAsia="Calibri" w:cs="Calibri" w:ascii="Calibri" w:hAnsi="Calibri"/>
+          <w:rFonts w:eastAsia="Calibri" w:cs="Calibri"/>
           <w:b/>
           <w:lang w:val="cs-CZ"/>
         </w:rPr>
@@ -1377,7 +1377,7 @@
       </w:r>
       <w:r>
         <w:rPr>
-          <w:rFonts w:eastAsia="Calibri" w:cs="Calibri" w:ascii="Calibri" w:hAnsi="Calibri"/>
+          <w:rFonts w:eastAsia="Calibri" w:cs="Calibri"/>
           <w:b/>
           <w:spacing w:val="-1"/>
           <w:lang w:val="cs-CZ"/>
@@ -1386,7 +1386,7 @@
       </w:r>
       <w:r>
         <w:rPr>
-          <w:rFonts w:eastAsia="Calibri" w:cs="Calibri" w:ascii="Calibri" w:hAnsi="Calibri"/>
+          <w:rFonts w:eastAsia="Calibri" w:cs="Calibri"/>
           <w:b/>
           <w:spacing w:val="1"/>
           <w:lang w:val="cs-CZ"/>
@@ -1395,7 +1395,7 @@
       </w:r>
       <w:r>
         <w:rPr>
-          <w:rFonts w:eastAsia="Calibri" w:cs="Calibri" w:ascii="Calibri" w:hAnsi="Calibri"/>
+          <w:rFonts w:eastAsia="Calibri" w:cs="Calibri"/>
           <w:b/>
           <w:spacing w:val="-1"/>
           <w:lang w:val="cs-CZ"/>
@@ -1404,7 +1404,7 @@
       </w:r>
       <w:r>
         <w:rPr>
-          <w:rFonts w:eastAsia="Calibri" w:cs="Calibri" w:ascii="Calibri" w:hAnsi="Calibri"/>
+          <w:rFonts w:eastAsia="Calibri" w:cs="Calibri"/>
           <w:b/>
           <w:lang w:val="cs-CZ"/>
         </w:rPr>
@@ -1412,7 +1412,7 @@
       </w:r>
       <w:r>
         <w:rPr>
-          <w:rFonts w:eastAsia="Calibri" w:cs="Calibri" w:ascii="Calibri" w:hAnsi="Calibri"/>
+          <w:rFonts w:eastAsia="Calibri" w:cs="Calibri"/>
           <w:b/>
           <w:spacing w:val="-1"/>
           <w:lang w:val="cs-CZ"/>
@@ -1421,7 +1421,7 @@
       </w:r>
       <w:r>
         <w:rPr>
-          <w:rFonts w:eastAsia="Calibri" w:cs="Calibri" w:ascii="Calibri" w:hAnsi="Calibri"/>
+          <w:rFonts w:eastAsia="Calibri" w:cs="Calibri"/>
           <w:b/>
           <w:spacing w:val="1"/>
           <w:lang w:val="cs-CZ"/>
@@ -1430,7 +1430,7 @@
       </w:r>
       <w:r>
         <w:rPr>
-          <w:rFonts w:eastAsia="Calibri" w:cs="Calibri" w:ascii="Calibri" w:hAnsi="Calibri"/>
+          <w:rFonts w:eastAsia="Calibri" w:cs="Calibri"/>
           <w:b/>
           <w:spacing w:val="-1"/>
           <w:lang w:val="cs-CZ"/>
@@ -1439,7 +1439,7 @@
       </w:r>
       <w:r>
         <w:rPr>
-          <w:rFonts w:eastAsia="Calibri" w:cs="Calibri" w:ascii="Calibri" w:hAnsi="Calibri"/>
+          <w:rFonts w:eastAsia="Calibri" w:cs="Calibri"/>
           <w:b/>
           <w:lang w:val="cs-CZ"/>
         </w:rPr>
@@ -1447,7 +1447,7 @@
       </w:r>
       <w:r>
         <w:rPr>
-          <w:rFonts w:eastAsia="Calibri" w:cs="Calibri" w:ascii="Calibri" w:hAnsi="Calibri"/>
+          <w:rFonts w:eastAsia="Calibri" w:cs="Calibri"/>
           <w:b/>
           <w:spacing w:val="-1"/>
           <w:lang w:val="cs-CZ"/>
@@ -1456,7 +1456,7 @@
       </w:r>
       <w:r>
         <w:rPr>
-          <w:rFonts w:eastAsia="Calibri" w:cs="Calibri" w:ascii="Calibri" w:hAnsi="Calibri"/>
+          <w:rFonts w:eastAsia="Calibri" w:cs="Calibri"/>
           <w:b/>
           <w:lang w:val="cs-CZ"/>
         </w:rPr>
@@ -1464,7 +1464,7 @@
       </w:r>
       <w:r>
         <w:rPr>
-          <w:rFonts w:eastAsia="Calibri" w:cs="Calibri" w:ascii="Calibri" w:hAnsi="Calibri"/>
+          <w:rFonts w:eastAsia="Calibri" w:cs="Calibri"/>
           <w:b/>
           <w:spacing w:val="-1"/>
           <w:lang w:val="cs-CZ"/>
@@ -1473,7 +1473,7 @@
       </w:r>
       <w:r>
         <w:rPr>
-          <w:rFonts w:eastAsia="Calibri" w:cs="Calibri" w:ascii="Calibri" w:hAnsi="Calibri"/>
+          <w:rFonts w:eastAsia="Calibri" w:cs="Calibri"/>
           <w:b/>
           <w:spacing w:val="1"/>
           <w:lang w:val="cs-CZ"/>
@@ -1482,7 +1482,7 @@
       </w:r>
       <w:r>
         <w:rPr>
-          <w:rFonts w:eastAsia="Calibri" w:cs="Calibri" w:ascii="Calibri" w:hAnsi="Calibri"/>
+          <w:rFonts w:eastAsia="Calibri" w:cs="Calibri"/>
           <w:b/>
           <w:lang w:val="cs-CZ"/>
         </w:rPr>
@@ -1490,7 +1490,7 @@
       </w:r>
       <w:r>
         <w:rPr>
-          <w:rFonts w:eastAsia="Calibri" w:cs="Calibri" w:ascii="Calibri" w:hAnsi="Calibri"/>
+          <w:rFonts w:eastAsia="Calibri" w:cs="Calibri"/>
           <w:b/>
           <w:spacing w:val="1"/>
           <w:lang w:val="cs-CZ"/>
@@ -1499,7 +1499,7 @@
       </w:r>
       <w:r>
         <w:rPr>
-          <w:rFonts w:eastAsia="Calibri" w:cs="Calibri" w:ascii="Calibri" w:hAnsi="Calibri"/>
+          <w:rFonts w:eastAsia="Calibri" w:cs="Calibri"/>
           <w:b/>
           <w:lang w:val="cs-CZ"/>
         </w:rPr>
@@ -1507,7 +1507,7 @@
       </w:r>
       <w:r>
         <w:rPr>
-          <w:rFonts w:eastAsia="Calibri" w:cs="Calibri" w:ascii="Calibri" w:hAnsi="Calibri"/>
+          <w:rFonts w:eastAsia="Calibri" w:cs="Calibri"/>
           <w:b/>
           <w:spacing w:val="-1"/>
           <w:lang w:val="cs-CZ"/>
@@ -1516,7 +1516,7 @@
       </w:r>
       <w:r>
         <w:rPr>
-          <w:rFonts w:eastAsia="Calibri" w:cs="Calibri" w:ascii="Calibri" w:hAnsi="Calibri"/>
+          <w:rFonts w:eastAsia="Calibri" w:cs="Calibri"/>
           <w:b/>
           <w:lang w:val="cs-CZ"/>
         </w:rPr>
@@ -1524,7 +1524,7 @@
       </w:r>
       <w:r>
         <w:rPr>
-          <w:rFonts w:eastAsia="Calibri" w:cs="Calibri" w:ascii="Calibri" w:hAnsi="Calibri"/>
+          <w:rFonts w:eastAsia="Calibri" w:cs="Calibri"/>
           <w:b/>
           <w:spacing w:val="1"/>
           <w:lang w:val="cs-CZ"/>
@@ -1533,7 +1533,7 @@
       </w:r>
       <w:r>
         <w:rPr>
-          <w:rFonts w:eastAsia="Calibri" w:cs="Calibri" w:ascii="Calibri" w:hAnsi="Calibri"/>
+          <w:rFonts w:eastAsia="Calibri" w:cs="Calibri"/>
           <w:b/>
           <w:lang w:val="cs-CZ"/>
         </w:rPr>
@@ -1541,7 +1541,7 @@
       </w:r>
       <w:r>
         <w:rPr>
-          <w:rFonts w:eastAsia="Calibri" w:cs="Calibri" w:ascii="Calibri" w:hAnsi="Calibri"/>
+          <w:rFonts w:eastAsia="Calibri" w:cs="Calibri"/>
           <w:b/>
           <w:spacing w:val="-1"/>
           <w:lang w:val="cs-CZ"/>
@@ -1550,7 +1550,7 @@
       </w:r>
       <w:r>
         <w:rPr>
-          <w:rFonts w:eastAsia="Calibri" w:cs="Calibri" w:ascii="Calibri" w:hAnsi="Calibri"/>
+          <w:rFonts w:eastAsia="Calibri" w:cs="Calibri"/>
           <w:b/>
           <w:spacing w:val="1"/>
           <w:lang w:val="cs-CZ"/>
@@ -1559,7 +1559,7 @@
       </w:r>
       <w:r>
         <w:rPr>
-          <w:rFonts w:eastAsia="Calibri" w:cs="Calibri" w:ascii="Calibri" w:hAnsi="Calibri"/>
+          <w:rFonts w:eastAsia="Calibri" w:cs="Calibri"/>
           <w:b/>
           <w:lang w:val="cs-CZ"/>
         </w:rPr>
@@ -1567,7 +1567,7 @@
       </w:r>
       <w:r>
         <w:rPr>
-          <w:rFonts w:eastAsia="Calibri" w:cs="Calibri" w:ascii="Calibri" w:hAnsi="Calibri"/>
+          <w:rFonts w:eastAsia="Calibri" w:cs="Calibri"/>
           <w:b/>
           <w:spacing w:val="1"/>
           <w:lang w:val="cs-CZ"/>
@@ -1576,7 +1576,7 @@
       </w:r>
       <w:r>
         <w:rPr>
-          <w:rFonts w:eastAsia="Calibri" w:cs="Calibri" w:ascii="Calibri" w:hAnsi="Calibri"/>
+          <w:rFonts w:eastAsia="Calibri" w:cs="Calibri"/>
           <w:b/>
           <w:spacing w:val="-1"/>
           <w:lang w:val="cs-CZ"/>
@@ -1585,7 +1585,7 @@
       </w:r>
       <w:r>
         <w:rPr>
-          <w:rFonts w:eastAsia="Calibri" w:cs="Calibri" w:ascii="Calibri" w:hAnsi="Calibri"/>
+          <w:rFonts w:eastAsia="Calibri" w:cs="Calibri"/>
           <w:b/>
           <w:spacing w:val="-3"/>
           <w:lang w:val="cs-CZ"/>
@@ -1594,7 +1594,7 @@
       </w:r>
       <w:r>
         <w:rPr>
-          <w:rFonts w:eastAsia="Calibri" w:cs="Calibri" w:ascii="Calibri" w:hAnsi="Calibri"/>
+          <w:rFonts w:eastAsia="Calibri" w:cs="Calibri"/>
           <w:b/>
           <w:spacing w:val="-1"/>
           <w:lang w:val="cs-CZ"/>
@@ -1603,7 +1603,7 @@
       </w:r>
       <w:r>
         <w:rPr>
-          <w:rFonts w:eastAsia="Calibri" w:cs="Calibri" w:ascii="Calibri" w:hAnsi="Calibri"/>
+          <w:rFonts w:eastAsia="Calibri" w:cs="Calibri"/>
           <w:b/>
           <w:spacing w:val="1"/>
           <w:lang w:val="cs-CZ"/>
@@ -1612,7 +1612,7 @@
       </w:r>
       <w:r>
         <w:rPr>
-          <w:rFonts w:eastAsia="Calibri" w:cs="Calibri" w:ascii="Calibri" w:hAnsi="Calibri"/>
+          <w:rFonts w:eastAsia="Calibri" w:cs="Calibri"/>
           <w:b/>
           <w:spacing w:val="-1"/>
           <w:lang w:val="cs-CZ"/>
@@ -1621,7 +1621,7 @@
       </w:r>
       <w:r>
         <w:rPr>
-          <w:rFonts w:eastAsia="Calibri" w:cs="Calibri" w:ascii="Calibri" w:hAnsi="Calibri"/>
+          <w:rFonts w:eastAsia="Calibri" w:cs="Calibri"/>
           <w:b/>
           <w:lang w:val="cs-CZ"/>
         </w:rPr>
@@ -1629,7 +1629,7 @@
       </w:r>
       <w:r>
         <w:rPr>
-          <w:rFonts w:eastAsia="Calibri" w:cs="Calibri" w:ascii="Calibri" w:hAnsi="Calibri"/>
+          <w:rFonts w:eastAsia="Calibri" w:cs="Calibri"/>
           <w:b/>
           <w:spacing w:val="1"/>
           <w:lang w:val="cs-CZ"/>
@@ -1638,7 +1638,7 @@
       </w:r>
       <w:r>
         <w:rPr>
-          <w:rFonts w:eastAsia="Calibri" w:cs="Calibri" w:ascii="Calibri" w:hAnsi="Calibri"/>
+          <w:rFonts w:eastAsia="Calibri" w:cs="Calibri"/>
           <w:b/>
           <w:lang w:val="cs-CZ"/>
         </w:rPr>
@@ -1646,7 +1646,7 @@
       </w:r>
       <w:r>
         <w:rPr>
-          <w:rFonts w:eastAsia="Calibri" w:cs="Calibri" w:ascii="Calibri" w:hAnsi="Calibri"/>
+          <w:rFonts w:eastAsia="Calibri" w:cs="Calibri"/>
           <w:b/>
           <w:spacing w:val="-1"/>
           <w:lang w:val="cs-CZ"/>
@@ -1655,7 +1655,7 @@
       </w:r>
       <w:r>
         <w:rPr>
-          <w:rFonts w:eastAsia="Calibri" w:cs="Calibri" w:ascii="Calibri" w:hAnsi="Calibri"/>
+          <w:rFonts w:eastAsia="Calibri" w:cs="Calibri"/>
           <w:b/>
           <w:spacing w:val="1"/>
           <w:lang w:val="cs-CZ"/>
@@ -1664,7 +1664,7 @@
       </w:r>
       <w:r>
         <w:rPr>
-          <w:rFonts w:eastAsia="Calibri" w:cs="Calibri" w:ascii="Calibri" w:hAnsi="Calibri"/>
+          <w:rFonts w:eastAsia="Calibri" w:cs="Calibri"/>
           <w:b/>
           <w:spacing w:val="-3"/>
           <w:lang w:val="cs-CZ"/>
@@ -1673,7 +1673,7 @@
       </w:r>
       <w:r>
         <w:rPr>
-          <w:rFonts w:eastAsia="Calibri" w:cs="Calibri" w:ascii="Calibri" w:hAnsi="Calibri"/>
+          <w:rFonts w:eastAsia="Calibri" w:cs="Calibri"/>
           <w:b/>
           <w:lang w:val="cs-CZ"/>
         </w:rPr>
@@ -1681,7 +1681,7 @@
       </w:r>
       <w:r>
         <w:rPr>
-          <w:rFonts w:eastAsia="Calibri" w:cs="Calibri" w:ascii="Calibri" w:hAnsi="Calibri"/>
+          <w:rFonts w:eastAsia="Calibri" w:cs="Calibri"/>
           <w:b/>
           <w:spacing w:val="-1"/>
           <w:lang w:val="cs-CZ"/>
@@ -1690,7 +1690,7 @@
       </w:r>
       <w:r>
         <w:rPr>
-          <w:rFonts w:eastAsia="Calibri" w:cs="Calibri" w:ascii="Calibri" w:hAnsi="Calibri"/>
+          <w:rFonts w:eastAsia="Calibri" w:cs="Calibri"/>
           <w:b/>
           <w:spacing w:val="1"/>
           <w:lang w:val="cs-CZ"/>
@@ -1699,7 +1699,7 @@
       </w:r>
       <w:r>
         <w:rPr>
-          <w:rFonts w:eastAsia="Calibri" w:cs="Calibri" w:ascii="Calibri" w:hAnsi="Calibri"/>
+          <w:rFonts w:eastAsia="Calibri" w:cs="Calibri"/>
           <w:b/>
           <w:spacing w:val="-1"/>
           <w:lang w:val="cs-CZ"/>
@@ -1708,7 +1708,7 @@
       </w:r>
       <w:r>
         <w:rPr>
-          <w:rFonts w:eastAsia="Calibri" w:cs="Calibri" w:ascii="Calibri" w:hAnsi="Calibri"/>
+          <w:rFonts w:eastAsia="Calibri" w:cs="Calibri"/>
           <w:b/>
           <w:spacing w:val="1"/>
           <w:lang w:val="cs-CZ"/>
@@ -1717,7 +1717,7 @@
       </w:r>
       <w:r>
         <w:rPr>
-          <w:rFonts w:eastAsia="Calibri" w:cs="Calibri" w:ascii="Calibri" w:hAnsi="Calibri"/>
+          <w:rFonts w:eastAsia="Calibri" w:cs="Calibri"/>
           <w:b/>
           <w:spacing w:val="-1"/>
           <w:lang w:val="cs-CZ"/>
@@ -1726,7 +1726,7 @@
       </w:r>
       <w:r>
         <w:rPr>
-          <w:rFonts w:eastAsia="Calibri" w:cs="Calibri" w:ascii="Calibri" w:hAnsi="Calibri"/>
+          <w:rFonts w:eastAsia="Calibri" w:cs="Calibri"/>
           <w:b/>
           <w:spacing w:val="1"/>
           <w:lang w:val="cs-CZ"/>
@@ -1735,7 +1735,7 @@
       </w:r>
       <w:r>
         <w:rPr>
-          <w:rFonts w:eastAsia="Calibri" w:cs="Calibri" w:ascii="Calibri" w:hAnsi="Calibri"/>
+          <w:rFonts w:eastAsia="Calibri" w:cs="Calibri"/>
           <w:b/>
           <w:lang w:val="cs-CZ"/>
         </w:rPr>
@@ -1743,7 +1743,7 @@
       </w:r>
       <w:r>
         <w:rPr>
-          <w:rFonts w:eastAsia="Calibri" w:cs="Calibri" w:ascii="Calibri" w:hAnsi="Calibri"/>
+          <w:rFonts w:eastAsia="Calibri" w:cs="Calibri"/>
           <w:b/>
           <w:spacing w:val="3"/>
           <w:lang w:val="cs-CZ"/>
@@ -1752,7 +1752,7 @@
       </w:r>
       <w:r>
         <w:rPr>
-          <w:rFonts w:eastAsia="Calibri" w:cs="Calibri" w:ascii="Calibri" w:hAnsi="Calibri"/>
+          <w:rFonts w:eastAsia="Calibri" w:cs="Calibri"/>
           <w:b/>
           <w:spacing w:val="-1"/>
           <w:lang w:val="cs-CZ"/>
@@ -1761,7 +1761,7 @@
       </w:r>
       <w:r>
         <w:rPr>
-          <w:rFonts w:eastAsia="Calibri" w:cs="Calibri" w:ascii="Calibri" w:hAnsi="Calibri"/>
+          <w:rFonts w:eastAsia="Calibri" w:cs="Calibri"/>
           <w:b/>
           <w:lang w:val="cs-CZ"/>
         </w:rPr>
@@ -1769,7 +1769,7 @@
       </w:r>
       <w:r>
         <w:rPr>
-          <w:rFonts w:eastAsia="Calibri" w:cs="Calibri" w:ascii="Calibri" w:hAnsi="Calibri"/>
+          <w:rFonts w:eastAsia="Calibri" w:cs="Calibri"/>
           <w:b/>
           <w:spacing w:val="-1"/>
           <w:lang w:val="cs-CZ"/>
@@ -1778,7 +1778,7 @@
       </w:r>
       <w:r>
         <w:rPr>
-          <w:rFonts w:eastAsia="Calibri" w:cs="Calibri" w:ascii="Calibri" w:hAnsi="Calibri"/>
+          <w:rFonts w:eastAsia="Calibri" w:cs="Calibri"/>
           <w:b/>
           <w:lang w:val="cs-CZ"/>
         </w:rPr>
@@ -1786,7 +1786,7 @@
       </w:r>
       <w:r>
         <w:rPr>
-          <w:rFonts w:eastAsia="Calibri" w:cs="Calibri" w:ascii="Calibri" w:hAnsi="Calibri"/>
+          <w:rFonts w:eastAsia="Calibri" w:cs="Calibri"/>
           <w:b/>
           <w:spacing w:val="1"/>
           <w:lang w:val="cs-CZ"/>
@@ -1795,7 +1795,7 @@
       </w:r>
       <w:r>
         <w:rPr>
-          <w:rFonts w:eastAsia="Calibri" w:cs="Calibri" w:ascii="Calibri" w:hAnsi="Calibri"/>
+          <w:rFonts w:eastAsia="Calibri" w:cs="Calibri"/>
           <w:b/>
           <w:lang w:val="cs-CZ"/>
         </w:rPr>
@@ -1803,7 +1803,7 @@
       </w:r>
       <w:r>
         <w:rPr>
-          <w:rFonts w:eastAsia="Calibri" w:cs="Calibri" w:ascii="Calibri" w:hAnsi="Calibri"/>
+          <w:rFonts w:eastAsia="Calibri" w:cs="Calibri"/>
           <w:b/>
           <w:spacing w:val="-1"/>
           <w:lang w:val="cs-CZ"/>
@@ -1812,7 +1812,7 @@
       </w:r>
       <w:r>
         <w:rPr>
-          <w:rFonts w:eastAsia="Calibri" w:cs="Calibri" w:ascii="Calibri" w:hAnsi="Calibri"/>
+          <w:rFonts w:eastAsia="Calibri" w:cs="Calibri"/>
           <w:b/>
           <w:lang w:val="cs-CZ"/>
         </w:rPr>
@@ -1820,7 +1820,7 @@
       </w:r>
       <w:r>
         <w:rPr>
-          <w:rFonts w:eastAsia="Calibri" w:cs="Calibri" w:ascii="Calibri" w:hAnsi="Calibri"/>
+          <w:rFonts w:eastAsia="Calibri" w:cs="Calibri"/>
           <w:b/>
           <w:spacing w:val="1"/>
           <w:w w:val="102"/>
@@ -1830,7 +1830,7 @@
       </w:r>
       <w:r>
         <w:rPr>
-          <w:rFonts w:eastAsia="Calibri" w:cs="Calibri" w:ascii="Calibri" w:hAnsi="Calibri"/>
+          <w:rFonts w:eastAsia="Calibri" w:cs="Calibri"/>
           <w:b/>
           <w:spacing w:val="-3"/>
           <w:w w:val="102"/>
@@ -1840,7 +1840,7 @@
       </w:r>
       <w:r>
         <w:rPr>
-          <w:rFonts w:eastAsia="Calibri" w:cs="Calibri" w:ascii="Calibri" w:hAnsi="Calibri"/>
+          <w:rFonts w:eastAsia="Calibri" w:cs="Calibri"/>
           <w:b/>
           <w:spacing w:val="1"/>
           <w:w w:val="99"/>
@@ -1850,7 +1850,7 @@
       </w:r>
       <w:r>
         <w:rPr>
-          <w:rFonts w:eastAsia="Calibri" w:cs="Calibri" w:ascii="Calibri" w:hAnsi="Calibri"/>
+          <w:rFonts w:eastAsia="Calibri" w:cs="Calibri"/>
           <w:b/>
           <w:w w:val="101"/>
           <w:lang w:val="cs-CZ"/>
@@ -1859,7 +1859,7 @@
       </w:r>
       <w:r>
         <w:rPr>
-          <w:rFonts w:eastAsia="Calibri" w:cs="Calibri" w:ascii="Calibri" w:hAnsi="Calibri"/>
+          <w:rFonts w:eastAsia="Calibri" w:cs="Calibri"/>
           <w:b/>
           <w:spacing w:val="1"/>
           <w:lang w:val="cs-CZ"/>
@@ -1868,7 +1868,7 @@
       </w:r>
       <w:r>
         <w:rPr>
-          <w:rFonts w:eastAsia="Calibri" w:cs="Calibri" w:ascii="Calibri" w:hAnsi="Calibri"/>
+          <w:rFonts w:eastAsia="Calibri" w:cs="Calibri"/>
           <w:b/>
           <w:spacing w:val="-1"/>
           <w:lang w:val="cs-CZ"/>
@@ -1877,7 +1877,7 @@
       </w:r>
       <w:r>
         <w:rPr>
-          <w:rFonts w:eastAsia="Calibri" w:cs="Calibri" w:ascii="Calibri" w:hAnsi="Calibri"/>
+          <w:rFonts w:eastAsia="Calibri" w:cs="Calibri"/>
           <w:b/>
           <w:spacing w:val="1"/>
           <w:w w:val="111"/>
@@ -1887,7 +1887,7 @@
       </w:r>
       <w:r>
         <w:rPr>
-          <w:rFonts w:eastAsia="Calibri" w:cs="Calibri" w:ascii="Calibri" w:hAnsi="Calibri"/>
+          <w:rFonts w:eastAsia="Calibri" w:cs="Calibri"/>
           <w:b/>
           <w:spacing w:val="-1"/>
           <w:lang w:val="cs-CZ"/>
@@ -1896,7 +1896,7 @@
       </w:r>
       <w:r>
         <w:rPr>
-          <w:rFonts w:eastAsia="Calibri" w:cs="Calibri" w:ascii="Calibri" w:hAnsi="Calibri"/>
+          <w:rFonts w:eastAsia="Calibri" w:cs="Calibri"/>
           <w:b/>
           <w:spacing w:val="1"/>
           <w:lang w:val="cs-CZ"/>
@@ -1905,7 +1905,7 @@
       </w:r>
       <w:r>
         <w:rPr>
-          <w:rFonts w:eastAsia="Calibri" w:cs="Calibri" w:ascii="Calibri" w:hAnsi="Calibri"/>
+          <w:rFonts w:eastAsia="Calibri" w:cs="Calibri"/>
           <w:b/>
           <w:w w:val="106"/>
           <w:lang w:val="cs-CZ"/>
@@ -1990,7 +1990,7 @@
       </w:pPr>
       <w:r>
         <w:rPr>
-          <w:rFonts w:eastAsia="Calibri" w:cs="Calibri" w:ascii="Calibri" w:hAnsi="Calibri"/>
+          <w:rFonts w:eastAsia="Calibri" w:cs="Calibri"/>
           <w:b/>
           <w:spacing w:val="1"/>
           <w:sz w:val="24"/>
@@ -2001,7 +2001,7 @@
       </w:r>
       <w:r>
         <w:rPr>
-          <w:rFonts w:eastAsia="Calibri" w:cs="Calibri" w:ascii="Calibri" w:hAnsi="Calibri"/>
+          <w:rFonts w:eastAsia="Calibri" w:cs="Calibri"/>
           <w:b/>
           <w:spacing w:val="-1"/>
           <w:sz w:val="24"/>
@@ -2012,7 +2012,7 @@
       </w:r>
       <w:r>
         <w:rPr>
-          <w:rFonts w:eastAsia="Calibri" w:cs="Calibri" w:ascii="Calibri" w:hAnsi="Calibri"/>
+          <w:rFonts w:eastAsia="Calibri" w:cs="Calibri"/>
           <w:b/>
           <w:sz w:val="24"/>
           <w:szCs w:val="24"/>
@@ -2022,7 +2022,7 @@
       </w:r>
       <w:r>
         <w:rPr>
-          <w:rFonts w:eastAsia="Calibri" w:cs="Calibri" w:ascii="Calibri" w:hAnsi="Calibri"/>
+          <w:rFonts w:eastAsia="Calibri" w:cs="Calibri"/>
           <w:b/>
           <w:spacing w:val="1"/>
           <w:sz w:val="24"/>
@@ -2033,7 +2033,7 @@
       </w:r>
       <w:r>
         <w:rPr>
-          <w:rFonts w:eastAsia="Calibri" w:cs="Calibri" w:ascii="Calibri" w:hAnsi="Calibri"/>
+          <w:rFonts w:eastAsia="Calibri" w:cs="Calibri"/>
           <w:b/>
           <w:sz w:val="24"/>
           <w:szCs w:val="24"/>
@@ -2043,7 +2043,7 @@
       </w:r>
       <w:r>
         <w:rPr>
-          <w:rFonts w:eastAsia="Calibri" w:cs="Calibri" w:ascii="Calibri" w:hAnsi="Calibri"/>
+          <w:rFonts w:eastAsia="Calibri" w:cs="Calibri"/>
           <w:b/>
           <w:spacing w:val="9"/>
           <w:sz w:val="24"/>
@@ -2054,7 +2054,7 @@
       </w:r>
       <w:r>
         <w:rPr>
-          <w:rFonts w:eastAsia="Calibri" w:cs="Calibri" w:ascii="Calibri" w:hAnsi="Calibri"/>
+          <w:rFonts w:eastAsia="Calibri" w:cs="Calibri"/>
           <w:b/>
           <w:spacing w:val="-1"/>
           <w:w w:val="107"/>
@@ -2066,7 +2066,7 @@
       </w:r>
       <w:r>
         <w:rPr>
-          <w:rFonts w:eastAsia="Calibri" w:cs="Calibri" w:ascii="Calibri" w:hAnsi="Calibri"/>
+          <w:rFonts w:eastAsia="Calibri" w:cs="Calibri"/>
           <w:b/>
           <w:spacing w:val="1"/>
           <w:w w:val="102"/>
@@ -2078,7 +2078,7 @@
       </w:r>
       <w:r>
         <w:rPr>
-          <w:rFonts w:eastAsia="Calibri" w:cs="Calibri" w:ascii="Calibri" w:hAnsi="Calibri"/>
+          <w:rFonts w:eastAsia="Calibri" w:cs="Calibri"/>
           <w:b/>
           <w:spacing w:val="1"/>
           <w:w w:val="103"/>
@@ -2090,7 +2090,7 @@
       </w:r>
       <w:r>
         <w:rPr>
-          <w:rFonts w:eastAsia="Calibri" w:cs="Calibri" w:ascii="Calibri" w:hAnsi="Calibri"/>
+          <w:rFonts w:eastAsia="Calibri" w:cs="Calibri"/>
           <w:b/>
           <w:spacing w:val="-2"/>
           <w:w w:val="101"/>
@@ -2102,7 +2102,7 @@
       </w:r>
       <w:r>
         <w:rPr>
-          <w:rFonts w:eastAsia="Calibri" w:cs="Calibri" w:ascii="Calibri" w:hAnsi="Calibri"/>
+          <w:rFonts w:eastAsia="Calibri" w:cs="Calibri"/>
           <w:b/>
           <w:spacing w:val="1"/>
           <w:w w:val="101"/>
@@ -2114,7 +2114,7 @@
       </w:r>
       <w:r>
         <w:rPr>
-          <w:rFonts w:eastAsia="Calibri" w:cs="Calibri" w:ascii="Calibri" w:hAnsi="Calibri"/>
+          <w:rFonts w:eastAsia="Calibri" w:cs="Calibri"/>
           <w:b/>
           <w:spacing w:val="-1"/>
           <w:w w:val="101"/>
@@ -2126,7 +2126,7 @@
       </w:r>
       <w:r>
         <w:rPr>
-          <w:rFonts w:eastAsia="Calibri" w:cs="Calibri" w:ascii="Calibri" w:hAnsi="Calibri"/>
+          <w:rFonts w:eastAsia="Calibri" w:cs="Calibri"/>
           <w:b/>
           <w:spacing w:val="-1"/>
           <w:w w:val="102"/>
@@ -2138,7 +2138,7 @@
       </w:r>
       <w:r>
         <w:rPr>
-          <w:rFonts w:eastAsia="Calibri" w:cs="Calibri" w:ascii="Calibri" w:hAnsi="Calibri"/>
+          <w:rFonts w:eastAsia="Calibri" w:cs="Calibri"/>
           <w:b/>
           <w:w w:val="98"/>
           <w:sz w:val="24"/>
@@ -2149,7 +2149,7 @@
       </w:r>
       <w:r>
         <w:rPr>
-          <w:rFonts w:eastAsia="Calibri" w:cs="Calibri" w:ascii="Calibri" w:hAnsi="Calibri"/>
+          <w:rFonts w:eastAsia="Calibri" w:cs="Calibri"/>
           <w:b/>
           <w:spacing w:val="-1"/>
           <w:w w:val="101"/>
@@ -2161,7 +2161,7 @@
       </w:r>
       <w:r>
         <w:rPr>
-          <w:rFonts w:eastAsia="Calibri" w:cs="Calibri" w:ascii="Calibri" w:hAnsi="Calibri"/>
+          <w:rFonts w:eastAsia="Calibri" w:cs="Calibri"/>
           <w:b/>
           <w:w w:val="102"/>
           <w:sz w:val="24"/>
@@ -2185,7 +2185,7 @@
       </w:pPr>
       <w:r>
         <w:rPr>
-          <w:rFonts w:eastAsia="Calibri" w:cs="Calibri" w:ascii="Calibri" w:hAnsi="Calibri"/>
+          <w:rFonts w:eastAsia="Calibri" w:cs="Calibri"/>
           <w:spacing w:val="1"/>
           <w:lang w:val="cs-CZ"/>
         </w:rPr>
@@ -2206,7 +2206,7 @@
       </w:pPr>
       <w:r>
         <w:rPr>
-          <w:rFonts w:eastAsia="Calibri" w:cs="Calibri" w:ascii="Calibri" w:hAnsi="Calibri"/>
+          <w:rFonts w:eastAsia="Calibri" w:cs="Calibri"/>
           <w:spacing w:val="1"/>
           <w:lang w:val="cs-CZ"/>
         </w:rPr>
@@ -2227,7 +2227,7 @@
       </w:pPr>
       <w:r>
         <w:rPr>
-          <w:rFonts w:eastAsia="Calibri" w:cs="Calibri" w:ascii="Calibri" w:hAnsi="Calibri"/>
+          <w:rFonts w:eastAsia="Calibri" w:cs="Calibri"/>
           <w:spacing w:val="1"/>
           <w:lang w:val="cs-CZ"/>
         </w:rPr>
@@ -2248,7 +2248,7 @@
       </w:pPr>
       <w:r>
         <w:rPr>
-          <w:rFonts w:eastAsia="Calibri" w:cs="Calibri" w:ascii="Calibri" w:hAnsi="Calibri"/>
+          <w:rFonts w:eastAsia="Calibri" w:cs="Calibri"/>
           <w:spacing w:val="1"/>
           <w:lang w:val="cs-CZ"/>
         </w:rPr>
@@ -2270,7 +2270,7 @@
       </w:pPr>
       <w:r>
         <w:rPr>
-          <w:rFonts w:eastAsia="Calibri" w:cs="Calibri" w:ascii="Calibri" w:hAnsi="Calibri"/>
+          <w:rFonts w:eastAsia="Calibri" w:cs="Calibri"/>
           <w:spacing w:val="1"/>
           <w:highlight w:val="yellow"/>
           <w:lang w:val="cs-CZ"/>
@@ -2291,7 +2291,7 @@
       </w:pPr>
       <w:r>
         <w:rPr>
-          <w:rFonts w:eastAsia="Calibri" w:cs="Calibri" w:ascii="Calibri" w:hAnsi="Calibri"/>
+          <w:rFonts w:eastAsia="Calibri" w:cs="Calibri"/>
           <w:spacing w:val="1"/>
           <w:lang w:val="cs-CZ"/>
         </w:rPr>
@@ -2301,7 +2301,7 @@
         <w:r>
           <w:rPr>
             <w:rStyle w:val="Hyperlink"/>
-            <w:rFonts w:eastAsia="Calibri" w:cs="Calibri" w:ascii="Calibri" w:hAnsi="Calibri"/>
+            <w:rFonts w:eastAsia="Calibri" w:cs="Calibri"/>
             <w:spacing w:val="1"/>
             <w:lang w:val="cs-CZ"/>
           </w:rPr>
@@ -2310,7 +2310,7 @@
       </w:hyperlink>
       <w:r>
         <w:rPr>
-          <w:rFonts w:eastAsia="Calibri" w:cs="Calibri" w:ascii="Calibri" w:hAnsi="Calibri"/>
+          <w:rFonts w:eastAsia="Calibri" w:cs="Calibri"/>
           <w:spacing w:val="1"/>
           <w:lang w:val="cs-CZ"/>
         </w:rPr>
@@ -2331,7 +2331,7 @@
       </w:pPr>
       <w:r>
         <w:rPr>
-          <w:rFonts w:eastAsia="Calibri" w:cs="Calibri" w:ascii="Calibri" w:hAnsi="Calibri"/>
+          <w:rFonts w:eastAsia="Calibri" w:cs="Calibri"/>
           <w:spacing w:val="1"/>
           <w:lang w:val="cs-CZ"/>
         </w:rPr>
@@ -2443,7 +2443,7 @@
       </w:pPr>
       <w:r>
         <w:rPr>
-          <w:rFonts w:eastAsia="Calibri" w:cs="Calibri" w:ascii="Calibri" w:hAnsi="Calibri"/>
+          <w:rFonts w:eastAsia="Calibri" w:cs="Calibri"/>
           <w:b/>
           <w:lang w:val="cs-CZ"/>
         </w:rPr>
@@ -2451,7 +2451,7 @@
       </w:r>
       <w:r>
         <w:rPr>
-          <w:rFonts w:eastAsia="Calibri" w:cs="Calibri" w:ascii="Calibri" w:hAnsi="Calibri"/>
+          <w:rFonts w:eastAsia="Calibri" w:cs="Calibri"/>
           <w:b/>
           <w:spacing w:val="5"/>
           <w:lang w:val="cs-CZ"/>
@@ -2460,7 +2460,7 @@
       </w:r>
       <w:r>
         <w:rPr>
-          <w:rFonts w:eastAsia="Calibri" w:cs="Calibri" w:ascii="Calibri" w:hAnsi="Calibri"/>
+          <w:rFonts w:eastAsia="Calibri" w:cs="Calibri"/>
           <w:b/>
           <w:spacing w:val="-1"/>
           <w:lang w:val="cs-CZ"/>
@@ -2469,7 +2469,7 @@
       </w:r>
       <w:r>
         <w:rPr>
-          <w:rFonts w:eastAsia="Calibri" w:cs="Calibri" w:ascii="Calibri" w:hAnsi="Calibri"/>
+          <w:rFonts w:eastAsia="Calibri" w:cs="Calibri"/>
           <w:b/>
           <w:spacing w:val="1"/>
           <w:lang w:val="cs-CZ"/>
@@ -2478,7 +2478,7 @@
       </w:r>
       <w:r>
         <w:rPr>
-          <w:rFonts w:eastAsia="Calibri" w:cs="Calibri" w:ascii="Calibri" w:hAnsi="Calibri"/>
+          <w:rFonts w:eastAsia="Calibri" w:cs="Calibri"/>
           <w:b/>
           <w:spacing w:val="-1"/>
           <w:lang w:val="cs-CZ"/>
@@ -2487,7 +2487,7 @@
       </w:r>
       <w:r>
         <w:rPr>
-          <w:rFonts w:eastAsia="Calibri" w:cs="Calibri" w:ascii="Calibri" w:hAnsi="Calibri"/>
+          <w:rFonts w:eastAsia="Calibri" w:cs="Calibri"/>
           <w:b/>
           <w:spacing w:val="1"/>
           <w:lang w:val="cs-CZ"/>
@@ -2496,7 +2496,7 @@
       </w:r>
       <w:r>
         <w:rPr>
-          <w:rFonts w:eastAsia="Calibri" w:cs="Calibri" w:ascii="Calibri" w:hAnsi="Calibri"/>
+          <w:rFonts w:eastAsia="Calibri" w:cs="Calibri"/>
           <w:b/>
           <w:spacing w:val="-1"/>
           <w:lang w:val="cs-CZ"/>
@@ -2505,7 +2505,7 @@
       </w:r>
       <w:r>
         <w:rPr>
-          <w:rFonts w:eastAsia="Calibri" w:cs="Calibri" w:ascii="Calibri" w:hAnsi="Calibri"/>
+          <w:rFonts w:eastAsia="Calibri" w:cs="Calibri"/>
           <w:b/>
           <w:spacing w:val="1"/>
           <w:lang w:val="cs-CZ"/>
@@ -2514,7 +2514,7 @@
       </w:r>
       <w:r>
         <w:rPr>
-          <w:rFonts w:eastAsia="Calibri" w:cs="Calibri" w:ascii="Calibri" w:hAnsi="Calibri"/>
+          <w:rFonts w:eastAsia="Calibri" w:cs="Calibri"/>
           <w:b/>
           <w:spacing w:val="-1"/>
           <w:lang w:val="cs-CZ"/>
@@ -2523,7 +2523,7 @@
       </w:r>
       <w:r>
         <w:rPr>
-          <w:rFonts w:eastAsia="Calibri" w:cs="Calibri" w:ascii="Calibri" w:hAnsi="Calibri"/>
+          <w:rFonts w:eastAsia="Calibri" w:cs="Calibri"/>
           <w:b/>
           <w:lang w:val="cs-CZ"/>
         </w:rPr>
@@ -2531,7 +2531,7 @@
       </w:r>
       <w:r>
         <w:rPr>
-          <w:rFonts w:eastAsia="Calibri" w:cs="Calibri" w:ascii="Calibri" w:hAnsi="Calibri"/>
+          <w:rFonts w:eastAsia="Calibri" w:cs="Calibri"/>
           <w:b/>
           <w:spacing w:val="21"/>
           <w:lang w:val="cs-CZ"/>
@@ -2540,7 +2540,7 @@
       </w:r>
       <w:r>
         <w:rPr>
-          <w:rFonts w:eastAsia="Calibri" w:cs="Calibri" w:ascii="Calibri" w:hAnsi="Calibri"/>
+          <w:rFonts w:eastAsia="Calibri" w:cs="Calibri"/>
           <w:b/>
           <w:spacing w:val="-1"/>
           <w:w w:val="106"/>
@@ -2550,7 +2550,7 @@
       </w:r>
       <w:r>
         <w:rPr>
-          <w:rFonts w:eastAsia="Calibri" w:cs="Calibri" w:ascii="Calibri" w:hAnsi="Calibri"/>
+          <w:rFonts w:eastAsia="Calibri" w:cs="Calibri"/>
           <w:b/>
           <w:spacing w:val="-1"/>
           <w:lang w:val="cs-CZ"/>
@@ -2559,7 +2559,7 @@
       </w:r>
       <w:r>
         <w:rPr>
-          <w:rFonts w:eastAsia="Calibri" w:cs="Calibri" w:ascii="Calibri" w:hAnsi="Calibri"/>
+          <w:rFonts w:eastAsia="Calibri" w:cs="Calibri"/>
           <w:b/>
           <w:spacing w:val="1"/>
           <w:lang w:val="cs-CZ"/>
@@ -2598,7 +2598,7 @@
       </w:pPr>
       <w:r>
         <w:rPr>
-          <w:rFonts w:eastAsia="Calibri" w:cs="Calibri" w:ascii="Calibri" w:hAnsi="Calibri"/>
+          <w:rFonts w:eastAsia="Calibri" w:cs="Calibri"/>
           <w:b/>
           <w:spacing w:val="1"/>
           <w:lang w:val="cs-CZ"/>
@@ -2609,7 +2609,7 @@
     <w:p>
       <w:pPr>
         <w:pStyle w:val="Normal"/>
-        <w:spacing w:lineRule="auto" w:line="240" w:before="41" w:after="0"/>
+        <w:spacing w:lineRule="auto" w:line="240" w:before="41" w:after="200"/>
         <w:ind w:start="116" w:end="4879"/>
         <w:jc w:val="both"/>
         <w:rPr>
@@ -2617,106 +2617,6 @@
           <w:b/>
           <w:lang w:val="cs-CZ"/>
         </w:rPr>
-      </w:pPr>
-      <w:r>
-        <w:rPr>
-          <w:rFonts w:eastAsia="Calibri" w:cs="Calibri" w:ascii="Calibri" w:hAnsi="Calibri"/>
-          <w:b/>
-          <w:spacing w:val="-1"/>
-          <w:lang w:val="cs-CZ"/>
-        </w:rPr>
-        <w:t>vedou</w:t>
-      </w:r>
-      <w:r>
-        <w:rPr>
-          <w:rFonts w:eastAsia="Calibri" w:cs="Calibri" w:ascii="Calibri" w:hAnsi="Calibri"/>
-          <w:b/>
-          <w:spacing w:val="1"/>
-          <w:lang w:val="cs-CZ"/>
-        </w:rPr>
-        <w:t>c</w:t>
-      </w:r>
-      <w:r>
-        <w:rPr>
-          <w:rFonts w:eastAsia="Calibri" w:cs="Calibri" w:ascii="Calibri" w:hAnsi="Calibri"/>
-          <w:b/>
-          <w:lang w:val="cs-CZ"/>
-        </w:rPr>
-        <w:t>í</w:t>
-      </w:r>
-      <w:r>
-        <w:rPr>
-          <w:rFonts w:eastAsia="Calibri" w:cs="Calibri" w:ascii="Calibri" w:hAnsi="Calibri"/>
-          <w:b/>
-          <w:spacing w:val="18"/>
-          <w:lang w:val="cs-CZ"/>
-        </w:rPr>
-        <w:t xml:space="preserve"> K</w:t>
-      </w:r>
-      <w:r>
-        <w:rPr>
-          <w:rFonts w:eastAsia="Calibri" w:cs="Calibri" w:ascii="Calibri" w:hAnsi="Calibri"/>
-          <w:b/>
-          <w:spacing w:val="-1"/>
-          <w:lang w:val="cs-CZ"/>
-        </w:rPr>
-        <w:t>a</w:t>
-      </w:r>
-      <w:r>
-        <w:rPr>
-          <w:rFonts w:eastAsia="Calibri" w:cs="Calibri" w:ascii="Calibri" w:hAnsi="Calibri"/>
-          <w:b/>
-          <w:lang w:val="cs-CZ"/>
-        </w:rPr>
-        <w:t>t</w:t>
-      </w:r>
-      <w:r>
-        <w:rPr>
-          <w:rFonts w:eastAsia="Calibri" w:cs="Calibri" w:ascii="Calibri" w:hAnsi="Calibri"/>
-          <w:b/>
-          <w:spacing w:val="-1"/>
-          <w:lang w:val="cs-CZ"/>
-        </w:rPr>
-        <w:t>ed</w:t>
-      </w:r>
-      <w:r>
-        <w:rPr>
-          <w:rFonts w:eastAsia="Calibri" w:cs="Calibri" w:ascii="Calibri" w:hAnsi="Calibri"/>
-          <w:b/>
-          <w:spacing w:val="1"/>
-          <w:lang w:val="cs-CZ"/>
-        </w:rPr>
-        <w:t>r</w:t>
-      </w:r>
-      <w:r>
-        <w:rPr>
-          <w:rFonts w:eastAsia="Calibri" w:cs="Calibri" w:ascii="Calibri" w:hAnsi="Calibri"/>
-          <w:b/>
-          <w:lang w:val="cs-CZ"/>
-        </w:rPr>
-        <w:t>y</w:t>
-      </w:r>
-      <w:r>
-        <w:rPr>
-          <w:rFonts w:eastAsia="Calibri" w:cs="Calibri" w:ascii="Calibri" w:hAnsi="Calibri"/>
-          <w:b/>
-          <w:spacing w:val="21"/>
-          <w:lang w:val="cs-CZ"/>
-        </w:rPr>
-        <w:t xml:space="preserve"> </w:t>
-      </w:r>
-      <w:r>
-        <w:rPr>
-          <w:rFonts w:eastAsia="Calibri" w:cs="Calibri" w:ascii="Calibri" w:hAnsi="Calibri"/>
-          <w:b/>
-          <w:spacing w:val="-3"/>
-          <w:lang w:val="cs-CZ"/>
-        </w:rPr>
-        <w:t>technických studií</w:t>
-      </w:r>
-    </w:p>
-    <w:p>
-      <w:pPr>
         <w:sectPr>
           <w:type w:val="nextPage"/>
           <w:pgSz w:w="11906" w:h="16838"/>
@@ -2724,8 +2624,105 @@
           <w:pgNumType w:fmt="decimal"/>
           <w:formProt w:val="false"/>
           <w:textDirection w:val="lrTb"/>
+          <w:docGrid w:type="default" w:linePitch="100" w:charSpace="0"/>
         </w:sectPr>
       </w:pPr>
+      <w:r>
+        <w:rPr>
+          <w:rFonts w:eastAsia="Calibri" w:cs="Calibri"/>
+          <w:b/>
+          <w:spacing w:val="-1"/>
+          <w:lang w:val="cs-CZ"/>
+        </w:rPr>
+        <w:t>vedou</w:t>
+      </w:r>
+      <w:r>
+        <w:rPr>
+          <w:rFonts w:eastAsia="Calibri" w:cs="Calibri"/>
+          <w:b/>
+          <w:spacing w:val="1"/>
+          <w:lang w:val="cs-CZ"/>
+        </w:rPr>
+        <w:t>c</w:t>
+      </w:r>
+      <w:r>
+        <w:rPr>
+          <w:rFonts w:eastAsia="Calibri" w:cs="Calibri"/>
+          <w:b/>
+          <w:lang w:val="cs-CZ"/>
+        </w:rPr>
+        <w:t>í</w:t>
+      </w:r>
+      <w:r>
+        <w:rPr>
+          <w:rFonts w:eastAsia="Calibri" w:cs="Calibri"/>
+          <w:b/>
+          <w:spacing w:val="18"/>
+          <w:lang w:val="cs-CZ"/>
+        </w:rPr>
+        <w:t xml:space="preserve"> K</w:t>
+      </w:r>
+      <w:r>
+        <w:rPr>
+          <w:rFonts w:eastAsia="Calibri" w:cs="Calibri"/>
+          <w:b/>
+          <w:spacing w:val="-1"/>
+          <w:lang w:val="cs-CZ"/>
+        </w:rPr>
+        <w:t>a</w:t>
+      </w:r>
+      <w:r>
+        <w:rPr>
+          <w:rFonts w:eastAsia="Calibri" w:cs="Calibri"/>
+          <w:b/>
+          <w:lang w:val="cs-CZ"/>
+        </w:rPr>
+        <w:t>t</w:t>
+      </w:r>
+      <w:r>
+        <w:rPr>
+          <w:rFonts w:eastAsia="Calibri" w:cs="Calibri"/>
+          <w:b/>
+          <w:spacing w:val="-1"/>
+          <w:lang w:val="cs-CZ"/>
+        </w:rPr>
+        <w:t>ed</w:t>
+      </w:r>
+      <w:r>
+        <w:rPr>
+          <w:rFonts w:eastAsia="Calibri" w:cs="Calibri"/>
+          <w:b/>
+          <w:spacing w:val="1"/>
+          <w:lang w:val="cs-CZ"/>
+        </w:rPr>
+        <w:t>r</w:t>
+      </w:r>
+      <w:r>
+        <w:rPr>
+          <w:rFonts w:eastAsia="Calibri" w:cs="Calibri"/>
+          <w:b/>
+          <w:lang w:val="cs-CZ"/>
+        </w:rPr>
+        <w:t>y</w:t>
+      </w:r>
+      <w:r>
+        <w:rPr>
+          <w:rFonts w:eastAsia="Calibri" w:cs="Calibri"/>
+          <w:b/>
+          <w:spacing w:val="21"/>
+          <w:lang w:val="cs-CZ"/>
+        </w:rPr>
+        <w:t xml:space="preserve"> </w:t>
+      </w:r>
+      <w:r>
+        <w:rPr>
+          <w:rFonts w:eastAsia="Calibri" w:cs="Calibri"/>
+          <w:b/>
+          <w:spacing w:val="-3"/>
+          <w:lang w:val="cs-CZ"/>
+        </w:rPr>
+        <w:t>technických studií</w:t>
+      </w:r>
     </w:p>
     <w:p>
       <w:pPr>
@@ -2742,7 +2739,7 @@
       </w:pPr>
       <w:r>
         <w:rPr>
-          <w:rFonts w:eastAsia="Calibri" w:cs="Calibri" w:ascii="Calibri" w:hAnsi="Calibri"/>
+          <w:rFonts w:eastAsia="Calibri" w:cs="Calibri"/>
           <w:b/>
           <w:spacing w:val="1"/>
           <w:lang w:val="cs-CZ"/>
@@ -2765,7 +2762,7 @@
       </w:pPr>
       <w:r>
         <w:rPr>
-          <w:rFonts w:eastAsia="Calibri" w:cs="Calibri" w:ascii="Calibri" w:hAnsi="Calibri"/>
+          <w:rFonts w:eastAsia="Calibri" w:cs="Calibri"/>
           <w:b/>
           <w:spacing w:val="1"/>
           <w:lang w:val="cs-CZ"/>
@@ -2788,7 +2785,7 @@
       </w:pPr>
       <w:r>
         <w:rPr>
-          <w:rFonts w:eastAsia="Calibri" w:cs="Calibri" w:ascii="Calibri" w:hAnsi="Calibri"/>
+          <w:rFonts w:eastAsia="Calibri" w:cs="Calibri"/>
           <w:i/>
           <w:spacing w:val="-1"/>
           <w:lang w:val="cs-CZ"/>
@@ -2811,7 +2808,7 @@
       </w:pPr>
       <w:r>
         <w:rPr>
-          <w:rFonts w:eastAsia="Calibri" w:cs="Calibri" w:ascii="Calibri" w:hAnsi="Calibri"/>
+          <w:rFonts w:eastAsia="Calibri" w:cs="Calibri"/>
           <w:b/>
           <w:spacing w:val="1"/>
           <w:lang w:val="cs-CZ"/>
@@ -2833,7 +2830,7 @@
       </w:pPr>
       <w:r>
         <w:rPr>
-          <w:rFonts w:eastAsia="Calibri" w:cs="Calibri" w:ascii="Calibri" w:hAnsi="Calibri"/>
+          <w:rFonts w:eastAsia="Calibri" w:cs="Calibri"/>
           <w:b/>
           <w:spacing w:val="1"/>
           <w:lang w:val="cs-CZ"/>
@@ -2856,7 +2853,7 @@
       </w:pPr>
       <w:r>
         <w:rPr>
-          <w:rFonts w:eastAsia="Calibri" w:cs="Calibri" w:ascii="Calibri" w:hAnsi="Calibri"/>
+          <w:rFonts w:eastAsia="Calibri" w:cs="Calibri"/>
           <w:i/>
           <w:color w:val="FB9E00"/>
           <w:spacing w:val="-1"/>
@@ -2866,7 +2863,7 @@
       </w:r>
       <w:r>
         <w:rPr>
-          <w:rFonts w:eastAsia="Calibri" w:cs="Calibri" w:ascii="Calibri" w:hAnsi="Calibri"/>
+          <w:rFonts w:eastAsia="Calibri" w:cs="Calibri"/>
           <w:i/>
           <w:spacing w:val="-1"/>
           <w:lang w:val="cs-CZ"/>
@@ -2889,7 +2886,7 @@
       </w:pPr>
       <w:r>
         <w:rPr>
-          <w:rFonts w:eastAsia="Calibri" w:cs="Calibri" w:ascii="Calibri" w:hAnsi="Calibri"/>
+          <w:rFonts w:eastAsia="Calibri" w:cs="Calibri"/>
           <w:b/>
           <w:spacing w:val="1"/>
           <w:lang w:val="cs-CZ"/>
@@ -2911,7 +2908,7 @@
       </w:pPr>
       <w:r>
         <w:rPr>
-          <w:rFonts w:eastAsia="Calibri" w:cs="Calibri" w:ascii="Calibri" w:hAnsi="Calibri"/>
+          <w:rFonts w:eastAsia="Calibri" w:cs="Calibri"/>
           <w:b/>
           <w:spacing w:val="1"/>
           <w:lang w:val="cs-CZ"/>
@@ -2934,7 +2931,7 @@
       </w:pPr>
       <w:r>
         <w:rPr>
-          <w:rFonts w:eastAsia="Calibri" w:cs="Calibri" w:ascii="Calibri" w:hAnsi="Calibri"/>
+          <w:rFonts w:eastAsia="Calibri" w:cs="Calibri"/>
           <w:i/>
           <w:color w:val="FB9E00"/>
           <w:spacing w:val="-1"/>
@@ -2944,7 +2941,7 @@
       </w:r>
       <w:r>
         <w:rPr>
-          <w:rFonts w:eastAsia="Calibri" w:cs="Calibri" w:ascii="Calibri" w:hAnsi="Calibri"/>
+          <w:rFonts w:eastAsia="Calibri" w:cs="Calibri"/>
           <w:i/>
           <w:spacing w:val="-1"/>
           <w:lang w:val="cs-CZ"/>
@@ -2967,7 +2964,7 @@
       </w:pPr>
       <w:r>
         <w:rPr>
-          <w:rFonts w:eastAsia="Calibri" w:cs="Calibri" w:ascii="Calibri" w:hAnsi="Calibri"/>
+          <w:rFonts w:eastAsia="Calibri" w:cs="Calibri"/>
           <w:b/>
           <w:spacing w:val="1"/>
           <w:lang w:val="cs-CZ"/>
@@ -2989,7 +2986,7 @@
       </w:pPr>
       <w:r>
         <w:rPr>
-          <w:rFonts w:eastAsia="Calibri" w:cs="Calibri" w:ascii="Calibri" w:hAnsi="Calibri"/>
+          <w:rFonts w:eastAsia="Calibri" w:cs="Calibri"/>
           <w:b/>
           <w:spacing w:val="1"/>
           <w:lang w:val="cs-CZ"/>
@@ -3012,12 +3009,31 @@
       </w:pPr>
       <w:r>
         <w:rPr>
-          <w:rFonts w:eastAsia="Calibri" w:cs="Calibri" w:ascii="Calibri" w:hAnsi="Calibri"/>
-          <w:i/>
-          <w:spacing w:val="-1"/>
-          <w:lang w:val="cs-CZ"/>
-        </w:rPr>
-        <w:t>Překladače a interprety, srovnání. Formální jazyky, gramatiky a automaty. Lexikální analýza, principy a způsoby její implementace. Syntaktická analýza shora dolů a zdola nahoru. Syntaxí řízený překlad a generování mezikódu. Tabulka symbolů, typová kontrola a vlastnosti programu za běhu. Generování cílového kódu, strojově závislé a nezávislé optimalizace.</w:t>
+          <w:rFonts w:eastAsia="Calibri" w:cs="Calibri"/>
+          <w:i/>
+          <w:spacing w:val="-1"/>
+          <w:lang w:val="cs-CZ"/>
+        </w:rPr>
+        <w:t xml:space="preserve">Překladače a interprety, srovnání. Formální jazyky, gramatiky a automaty. </w:t>
+      </w:r>
+      <w:r>
+        <w:rPr>
+          <w:rFonts w:eastAsia="Calibri" w:cs="Calibri"/>
+          <w:i/>
+          <w:color w:val="FB9E00"/>
+          <w:spacing w:val="-1"/>
+          <w:lang w:val="cs-CZ"/>
+        </w:rPr>
+        <w:t>Lexikální analýza, principy a způsoby její implementace.</w:t>
+      </w:r>
+      <w:r>
+        <w:rPr>
+          <w:rFonts w:eastAsia="Calibri" w:cs="Calibri"/>
+          <w:i/>
+          <w:spacing w:val="-1"/>
+          <w:lang w:val="cs-CZ"/>
+        </w:rPr>
+        <w:t xml:space="preserve"> Syntaktická analýza shora dolů a zdola nahoru. Syntaxí řízený překlad a generování mezikódu. Tabulka symbolů, typová kontrola a vlastnosti programu za běhu. Generování cílového kódu, strojově závislé a nezávislé optimalizace.</w:t>
       </w:r>
     </w:p>
     <w:p>
@@ -3038,7 +3054,7 @@
       </w:r>
       <w:r>
         <w:rPr>
-          <w:rFonts w:eastAsia="Calibri" w:cs="Calibri" w:ascii="Calibri" w:hAnsi="Calibri"/>
+          <w:rFonts w:eastAsia="Calibri" w:cs="Calibri"/>
           <w:b/>
           <w:spacing w:val="1"/>
           <w:lang w:val="cs-CZ"/>
@@ -3061,7 +3077,7 @@
       </w:pPr>
       <w:r>
         <w:rPr>
-          <w:rFonts w:eastAsia="Calibri" w:cs="Calibri" w:ascii="Calibri" w:hAnsi="Calibri"/>
+          <w:rFonts w:eastAsia="Calibri" w:cs="Calibri"/>
           <w:b/>
           <w:spacing w:val="1"/>
           <w:lang w:val="cs-CZ"/>
@@ -3084,7 +3100,7 @@
       </w:pPr>
       <w:r>
         <w:rPr>
-          <w:rFonts w:eastAsia="Calibri" w:cs="Calibri" w:ascii="Calibri" w:hAnsi="Calibri"/>
+          <w:rFonts w:eastAsia="Calibri" w:cs="Calibri"/>
           <w:i/>
           <w:spacing w:val="-1"/>
           <w:lang w:val="cs-CZ"/>
@@ -3107,7 +3123,7 @@
       </w:pPr>
       <w:r>
         <w:rPr>
-          <w:rFonts w:eastAsia="Calibri" w:cs="Calibri" w:ascii="Calibri" w:hAnsi="Calibri"/>
+          <w:rFonts w:eastAsia="Calibri" w:cs="Calibri"/>
           <w:i/>
           <w:spacing w:val="-1"/>
           <w:lang w:val="cs-CZ"/>
@@ -3129,7 +3145,7 @@
       </w:pPr>
       <w:r>
         <w:rPr>
-          <w:rFonts w:eastAsia="Calibri" w:cs="Calibri" w:ascii="Calibri" w:hAnsi="Calibri"/>
+          <w:rFonts w:eastAsia="Calibri" w:cs="Calibri"/>
           <w:b/>
           <w:spacing w:val="1"/>
           <w:lang w:val="cs-CZ"/>
@@ -3152,7 +3168,7 @@
       </w:pPr>
       <w:r>
         <w:rPr>
-          <w:rFonts w:eastAsia="Calibri" w:cs="Calibri" w:ascii="Calibri" w:hAnsi="Calibri"/>
+          <w:rFonts w:eastAsia="Calibri" w:cs="Calibri"/>
           <w:i/>
           <w:spacing w:val="-1"/>
           <w:lang w:val="cs-CZ"/>
@@ -3175,7 +3191,7 @@
       </w:pPr>
       <w:r>
         <w:rPr>
-          <w:rFonts w:eastAsia="Calibri" w:cs="Calibri" w:ascii="Calibri" w:hAnsi="Calibri"/>
+          <w:rFonts w:eastAsia="Calibri" w:cs="Calibri"/>
           <w:i/>
           <w:spacing w:val="-1"/>
           <w:lang w:val="cs-CZ"/>
@@ -3197,7 +3213,7 @@
       </w:pPr>
       <w:r>
         <w:rPr>
-          <w:rFonts w:eastAsia="Calibri" w:cs="Calibri" w:ascii="Calibri" w:hAnsi="Calibri"/>
+          <w:rFonts w:eastAsia="Calibri" w:cs="Calibri"/>
           <w:b/>
           <w:spacing w:val="1"/>
           <w:lang w:val="cs-CZ"/>
@@ -3220,7 +3236,7 @@
       </w:pPr>
       <w:r>
         <w:rPr>
-          <w:rFonts w:eastAsia="Calibri" w:cs="Calibri" w:ascii="Calibri" w:hAnsi="Calibri"/>
+          <w:rFonts w:eastAsia="Calibri" w:cs="Calibri"/>
           <w:i/>
           <w:spacing w:val="-1"/>
           <w:lang w:val="cs-CZ"/>
@@ -3243,7 +3259,7 @@
       </w:pPr>
       <w:r>
         <w:rPr>
-          <w:rFonts w:eastAsia="Calibri" w:cs="Calibri" w:ascii="Calibri" w:hAnsi="Calibri"/>
+          <w:rFonts w:eastAsia="Calibri" w:cs="Calibri"/>
           <w:i/>
           <w:spacing w:val="-1"/>
           <w:lang w:val="cs-CZ"/>
@@ -3265,7 +3281,7 @@
       </w:pPr>
       <w:r>
         <w:rPr>
-          <w:rFonts w:eastAsia="Calibri" w:cs="Calibri" w:ascii="Calibri" w:hAnsi="Calibri"/>
+          <w:rFonts w:eastAsia="Calibri" w:cs="Calibri"/>
           <w:b/>
           <w:spacing w:val="1"/>
           <w:lang w:val="cs-CZ"/>
@@ -3288,8 +3304,9 @@
       </w:pPr>
       <w:r>
         <w:rPr>
-          <w:rFonts w:eastAsia="Calibri" w:cs="Calibri" w:ascii="Calibri" w:hAnsi="Calibri"/>
-          <w:i/>
+          <w:rFonts w:eastAsia="Calibri" w:cs="Calibri"/>
+          <w:i/>
+          <w:color w:val="FB9E00"/>
           <w:spacing w:val="-1"/>
           <w:lang w:val="cs-CZ"/>
         </w:rPr>
@@ -3311,7 +3328,7 @@
       </w:pPr>
       <w:r>
         <w:rPr>
-          <w:rFonts w:eastAsia="Calibri" w:cs="Calibri" w:ascii="Calibri" w:hAnsi="Calibri"/>
+          <w:rFonts w:eastAsia="Calibri" w:cs="Calibri"/>
           <w:i/>
           <w:spacing w:val="-1"/>
           <w:lang w:val="cs-CZ"/>
@@ -3336,7 +3353,7 @@
       </w:r>
       <w:r>
         <w:rPr>
-          <w:rFonts w:eastAsia="Calibri" w:cs="Calibri" w:ascii="Calibri" w:hAnsi="Calibri"/>
+          <w:rFonts w:eastAsia="Calibri" w:cs="Calibri"/>
           <w:b/>
           <w:spacing w:val="1"/>
           <w:lang w:val="cs-CZ"/>
@@ -3359,7 +3376,7 @@
       </w:pPr>
       <w:r>
         <w:rPr>
-          <w:rFonts w:eastAsia="Calibri" w:cs="Calibri" w:ascii="Calibri" w:hAnsi="Calibri"/>
+          <w:rFonts w:eastAsia="Calibri" w:cs="Calibri"/>
           <w:b/>
           <w:spacing w:val="1"/>
           <w:lang w:val="cs-CZ"/>
@@ -3382,7 +3399,7 @@
       </w:pPr>
       <w:r>
         <w:rPr>
-          <w:rFonts w:eastAsia="Calibri" w:cs="Calibri" w:ascii="Calibri" w:hAnsi="Calibri"/>
+          <w:rFonts w:eastAsia="Calibri" w:cs="Calibri"/>
           <w:i/>
           <w:spacing w:val="-1"/>
           <w:lang w:val="cs-CZ"/>
@@ -3405,7 +3422,7 @@
       </w:pPr>
       <w:r>
         <w:rPr>
-          <w:rFonts w:eastAsia="Calibri" w:cs="Calibri" w:ascii="Calibri" w:hAnsi="Calibri"/>
+          <w:rFonts w:eastAsia="Calibri" w:cs="Calibri"/>
           <w:i/>
           <w:spacing w:val="-1"/>
           <w:lang w:val="cs-CZ"/>
@@ -3427,7 +3444,7 @@
       </w:pPr>
       <w:r>
         <w:rPr>
-          <w:rFonts w:eastAsia="Calibri" w:cs="Calibri" w:ascii="Calibri" w:hAnsi="Calibri"/>
+          <w:rFonts w:eastAsia="Calibri" w:cs="Calibri"/>
           <w:b/>
           <w:spacing w:val="1"/>
           <w:lang w:val="cs-CZ"/>
@@ -3450,12 +3467,22 @@
       </w:pPr>
       <w:r>
         <w:rPr>
-          <w:rFonts w:eastAsia="Calibri" w:cs="Calibri" w:ascii="Calibri" w:hAnsi="Calibri"/>
-          <w:i/>
-          <w:spacing w:val="-1"/>
-          <w:lang w:val="cs-CZ"/>
-        </w:rPr>
-        <w:t>Plánování databáze (sběr požadavků a nalézání faktů, uživatelské pohledy, strategie konceptuálního návrhu). Funkční závislosti (definice, Armstrongova pravidla, minimální pokrytí, nalezení klíče). Normální formy relací (definice 1.-3. NF, metody normalizace, pokrytí závislostí, výhody a nevýhody normalizace, denormalizace). Pokročilejší rysy jazyka SQL (datové typy a operátory, pohledy, oprávnění, uživatelské role). Transakce (princip a účel, způsoby implementace, prokládání transakcí a související problémy, stupeň izolace a uzamykání). Fyzická vrstva databáze (reprezentace odvozených dat, zajištění integritních omezení, fyzické uložení tabulek, indexy, pohledy). Procedurální rozšíření SQL (účel, použití, kursory a triggery, možnosti pro zajištění integritních omezení). Objektově orientované databáze (motivace, výhody a nevýhody, základy objektového návrhu, třídy, metody, navazování vztahů). Objektově-relační model (motivace, vlastnosti, příklady)</w:t>
+          <w:rFonts w:eastAsia="Calibri" w:cs="Calibri"/>
+          <w:i/>
+          <w:color w:val="FB9E00"/>
+          <w:spacing w:val="-1"/>
+          <w:lang w:val="cs-CZ"/>
+        </w:rPr>
+        <w:t>Plánování databáze (sběr požadavků a nalézání faktů, uživatelské pohledy, strategie konceptuálního návrhu). Funkční závislosti (definice, Armstrongova pravidla, minimální pokrytí, nalezení klíče). Normální formy relací (definice 1.-3. NF, metody normalizace, pokrytí závislostí, výhody a nevýhody normalizace, denormalizace).</w:t>
+      </w:r>
+      <w:r>
+        <w:rPr>
+          <w:rFonts w:eastAsia="Calibri" w:cs="Calibri"/>
+          <w:i/>
+          <w:spacing w:val="-1"/>
+          <w:lang w:val="cs-CZ"/>
+        </w:rPr>
+        <w:t xml:space="preserve"> Pokročilejší rysy jazyka SQL (datové typy a operátory, pohledy, oprávnění, uživatelské role). Transakce (princip a účel, způsoby implementace, prokládání transakcí a související problémy, stupeň izolace a uzamykání). Fyzická vrstva databáze (reprezentace odvozených dat, zajištění integritních omezení, fyzické uložení tabulek, indexy, pohledy). Procedurální rozšíření SQL (účel, použití, kursory a triggery, možnosti pro zajištění integritních omezení). Objektově orientované databáze (motivace, výhody a nevýhody, základy objektového návrhu, třídy, metody, navazování vztahů). Objektově-relační model (motivace, vlastnosti, příklady)</w:t>
       </w:r>
     </w:p>
     <w:p>
@@ -3473,7 +3500,7 @@
       </w:pPr>
       <w:r>
         <w:rPr>
-          <w:rFonts w:eastAsia="Calibri" w:cs="Calibri" w:ascii="Calibri" w:hAnsi="Calibri"/>
+          <w:rFonts w:eastAsia="Calibri" w:cs="Calibri"/>
           <w:i/>
           <w:spacing w:val="-1"/>
           <w:lang w:val="cs-CZ"/>
@@ -3495,7 +3522,7 @@
       </w:pPr>
       <w:r>
         <w:rPr>
-          <w:rFonts w:eastAsia="Calibri" w:cs="Calibri" w:ascii="Calibri" w:hAnsi="Calibri"/>
+          <w:rFonts w:eastAsia="Calibri" w:cs="Calibri"/>
           <w:b/>
           <w:spacing w:val="1"/>
           <w:lang w:val="cs-CZ"/>
@@ -3518,7 +3545,7 @@
       </w:pPr>
       <w:r>
         <w:rPr>
-          <w:rFonts w:eastAsia="Calibri" w:cs="Calibri" w:ascii="Calibri" w:hAnsi="Calibri"/>
+          <w:rFonts w:eastAsia="Calibri" w:cs="Calibri"/>
           <w:i/>
           <w:spacing w:val="-1"/>
           <w:lang w:val="cs-CZ"/>
@@ -3541,7 +3568,7 @@
       </w:pPr>
       <w:r>
         <w:rPr>
-          <w:rFonts w:eastAsia="Calibri" w:cs="Calibri" w:ascii="Calibri" w:hAnsi="Calibri"/>
+          <w:rFonts w:eastAsia="Calibri" w:cs="Calibri"/>
           <w:i/>
           <w:spacing w:val="-1"/>
           <w:lang w:val="cs-CZ"/>
@@ -3563,7 +3590,7 @@
       </w:pPr>
       <w:r>
         <w:rPr>
-          <w:rFonts w:eastAsia="Calibri" w:cs="Calibri" w:ascii="Calibri" w:hAnsi="Calibri"/>
+          <w:rFonts w:eastAsia="Calibri" w:cs="Calibri"/>
           <w:b/>
           <w:spacing w:val="1"/>
           <w:lang w:val="cs-CZ"/>
@@ -3586,18 +3613,28 @@
       </w:pPr>
       <w:r>
         <w:rPr>
-          <w:rFonts w:eastAsia="Calibri" w:cs="Calibri" w:ascii="Calibri" w:hAnsi="Calibri"/>
-          <w:i/>
-          <w:spacing w:val="-1"/>
-          <w:lang w:val="cs-CZ"/>
-        </w:rPr>
-        <w:t>Inteligentní agenti (definice, základní typy agentů, PEAS, vlastnosti prostředí, reprezentace stavu prostředí, praktické příklady). Řešení problémů prohledáváním stavového prostoru (neinformované a </w:t>
+          <w:rFonts w:eastAsia="Calibri" w:cs="Calibri"/>
+          <w:i/>
+          <w:color w:val="FB9E00"/>
+          <w:spacing w:val="-1"/>
+          <w:lang w:val="cs-CZ"/>
+        </w:rPr>
+        <w:t>Inteligentní agenti (definice, základní typy agentů, PEAS, vlastnosti prostředí, reprezentace stavu prostředí, praktické příklady).</w:t>
+      </w:r>
+      <w:r>
+        <w:rPr>
+          <w:rFonts w:eastAsia="Calibri" w:cs="Calibri"/>
+          <w:i/>
+          <w:spacing w:val="-1"/>
+          <w:lang w:val="cs-CZ"/>
+        </w:rPr>
+        <w:t xml:space="preserve"> Řešení problémů prohledáváním stavového prostoru (neinformované a </w:t>
       </w:r>
       <w:bookmarkStart w:id="0" w:name="_GoBack"/>
       <w:bookmarkEnd w:id="0"/>
       <w:r>
         <w:rPr>
-          <w:rFonts w:eastAsia="Calibri" w:cs="Calibri" w:ascii="Calibri" w:hAnsi="Calibri"/>
+          <w:rFonts w:eastAsia="Calibri" w:cs="Calibri"/>
           <w:i/>
           <w:spacing w:val="-1"/>
           <w:lang w:val="cs-CZ"/>
@@ -3620,7 +3657,7 @@
       </w:pPr>
       <w:r>
         <w:rPr>
-          <w:rFonts w:eastAsia="Calibri" w:cs="Calibri" w:ascii="Calibri" w:hAnsi="Calibri"/>
+          <w:rFonts w:eastAsia="Calibri" w:cs="Calibri"/>
           <w:b/>
           <w:spacing w:val="1"/>
           <w:lang w:val="cs-CZ"/>
@@ -3642,7 +3679,7 @@
       </w:pPr>
       <w:r>
         <w:rPr>
-          <w:rFonts w:eastAsia="Calibri" w:cs="Calibri" w:ascii="Calibri" w:hAnsi="Calibri"/>
+          <w:rFonts w:eastAsia="Calibri" w:cs="Calibri"/>
           <w:i/>
           <w:spacing w:val="-1"/>
           <w:lang w:val="cs-CZ"/>
@@ -4063,6 +4100,7 @@
     <w:rsid w:val="00a91ae1"/>
     <w:pPr>
       <w:widowControl w:val="false"/>
+      <w:suppressAutoHyphens w:val="true"/>
       <w:bidi w:val="0"/>
       <w:spacing w:lineRule="auto" w:line="276" w:before="0" w:after="200"/>
       <w:jc w:val="start"/>
@@ -4234,18 +4272,45 @@
       <w:rFonts w:cs="Noto Sans Devanagari"/>
     </w:rPr>
   </w:style>
+  <w:style w:type="paragraph" w:styleId="Nadpisuser">
+    <w:name w:val="Nadpis (user)"/>
+    <w:basedOn w:val="Normal"/>
+    <w:next w:val="BodyText"/>
+    <w:qFormat/>
+    <w:pPr>
+      <w:keepNext w:val="true"/>
+      <w:spacing w:before="240" w:after="120"/>
+    </w:pPr>
+    <w:rPr>
+      <w:rFonts w:ascii="Liberation Sans" w:hAnsi="Liberation Sans" w:eastAsia="Noto Sans CJK SC" w:cs="Noto Sans Devanagari"/>
+      <w:sz w:val="28"/>
+      <w:szCs w:val="28"/>
+    </w:rPr>
+  </w:style>
+  <w:style w:type="paragraph" w:styleId="Rejstkuser">
+    <w:name w:val="Rejstřík (user)"/>
+    <w:basedOn w:val="Normal"/>
+    <w:qFormat/>
+    <w:pPr>
+      <w:suppressLineNumbers/>
+    </w:pPr>
+    <w:rPr>
+      <w:rFonts w:cs="Noto Sans Devanagari"/>
+    </w:rPr>
+  </w:style>
   <w:style w:type="paragraph" w:styleId="Default" w:customStyle="1">
     <w:name w:val="Default"/>
     <w:qFormat/>
     <w:rsid w:val="00ec3d57"/>
     <w:pPr>
       <w:widowControl/>
+      <w:suppressAutoHyphens w:val="true"/>
       <w:bidi w:val="0"/>
       <w:spacing w:lineRule="auto" w:line="240" w:before="0" w:after="0"/>
       <w:jc w:val="start"/>
     </w:pPr>
     <w:rPr>
-      <w:rFonts w:ascii="Times New Roman" w:hAnsi="Times New Roman" w:cs="Times New Roman" w:eastAsia="Calibri"/>
+      <w:rFonts w:ascii="Times New Roman" w:hAnsi="Times New Roman" w:eastAsia="Calibri" w:cs="Times New Roman"/>
       <w:color w:val="000000"/>
       <w:kern w:val="0"/>
       <w:sz w:val="24"/>
@@ -4322,8 +4387,8 @@
       <w:szCs w:val="16"/>
     </w:rPr>
   </w:style>
-  <w:style w:type="numbering" w:styleId="Bezseznamu" w:default="1">
-    <w:name w:val="Bez seznamu"/>
+  <w:style w:type="numbering" w:styleId="Bezseznamuuser" w:default="1">
+    <w:name w:val="Bez seznamu (user)"/>
     <w:uiPriority w:val="99"/>
     <w:semiHidden/>
     <w:unhideWhenUsed/>

</xml_diff>

<commit_message>
Finalni podoba procesu uceni
pridane nove zapisky k BOD a DB. Pro zapamatovani je lepsi text
rozepisovat, potom dat chatbotovy, at to strukturuje strucnou formou v
odrazkach.
</commit_message>
<xml_diff>
--- a/okruhy.docx
+++ b/okruhy.docx
@@ -2859,16 +2859,54 @@
           <w:spacing w:val="-1"/>
           <w:lang w:val="cs-CZ"/>
         </w:rPr>
-        <w:t>Abstraktní datové typy zásobník, fronta, prioritní fronta, pole, tabulka, seznam, množina – jejich specifikace a možné způsoby implementace.</w:t>
-      </w:r>
-      <w:r>
-        <w:rPr>
-          <w:rFonts w:eastAsia="Calibri" w:cs="Calibri"/>
-          <w:i/>
-          <w:spacing w:val="-1"/>
-          <w:lang w:val="cs-CZ"/>
-        </w:rPr>
-        <w:t xml:space="preserve"> Algoritmy řazení výběrem (Selection Sort), vkládáním (Insertion Sort), zaměňováním (Bubble Sort), řazení haldou (Heap Sort), přihrádkové řazení (Radix Sort, Case Sort), řazení slučováním (Merge Sort), řazení dělením (Quick Sort). Minimální, průměrná a maximální asymptotická operační složitost algoritmů. Adresní metody vyhledávání (přímý přístup, otevřené a zřetězené rozptylování), jejich operační a paměťová složitost. Asociativní metody vyhledávání (sekvenční, binárním půlením, binární vyhledávací stromy), jejich operační a paměťová složitost.</w:t>
+        <w:t>Abstraktní datové typy zásobník, fronta, prioritní fronta, pole, tabulka, seznam, množina –</w:t>
+      </w:r>
+      <w:r>
+        <w:rPr>
+          <w:rFonts w:eastAsia="Calibri" w:cs="Calibri"/>
+          <w:i/>
+          <w:color w:val="FB9E00"/>
+          <w:spacing w:val="-1"/>
+          <w:lang w:val="cs-CZ"/>
+        </w:rPr>
+        <w:softHyphen/>
+      </w:r>
+      <w:r>
+        <w:rPr>
+          <w:rFonts w:eastAsia="Calibri" w:cs="Calibri"/>
+          <w:i/>
+          <w:color w:val="FB9E00"/>
+          <w:spacing w:val="-1"/>
+          <w:lang w:val="cs-CZ"/>
+        </w:rPr>
+        <w:t xml:space="preserve"> jejich specifikace a možné způsoby implementace.</w:t>
+      </w:r>
+      <w:r>
+        <w:rPr>
+          <w:rFonts w:eastAsia="Calibri" w:cs="Calibri"/>
+          <w:i/>
+          <w:spacing w:val="-1"/>
+          <w:lang w:val="cs-CZ"/>
+        </w:rPr>
+        <w:t xml:space="preserve"> Algoritmy řazení výběrem (Selection Sort), vkládáním (Insertion Sort), zaměňováním (Bubble Sort), řazení haldou (</w:t>
+      </w:r>
+      <w:r>
+        <w:rPr>
+          <w:rFonts w:eastAsia="Calibri" w:cs="Calibri"/>
+          <w:i/>
+          <w:spacing w:val="-1"/>
+          <w:lang w:val="cs-CZ"/>
+        </w:rPr>
+        <w:softHyphen/>
+      </w:r>
+      <w:r>
+        <w:rPr>
+          <w:rFonts w:eastAsia="Calibri" w:cs="Calibri"/>
+          <w:i/>
+          <w:spacing w:val="-1"/>
+          <w:lang w:val="cs-CZ"/>
+        </w:rPr>
+        <w:t>Heap Sort), přihrádkové řazení (Radix Sort, Case Sort), řazení slučováním (Merge Sort), řazení dělením (Quick Sort). Minimální, průměrná a maximální asymptotická operační složitost algoritmů. Adresní metody vyhledávání (přímý přístup, otevřené a zřetězené rozptylování), jejich operační a paměťová složitost. Asociativní metody vyhledávání (sekvenční, binárním půlením, binární vyhledávací stromy), jejich operační a paměťová složitost.</w:t>
       </w:r>
     </w:p>
     <w:p>
@@ -4387,8 +4425,8 @@
       <w:szCs w:val="16"/>
     </w:rPr>
   </w:style>
-  <w:style w:type="numbering" w:styleId="Bezseznamuuser" w:default="1">
-    <w:name w:val="Bez seznamu (user)"/>
+  <w:style w:type="numbering" w:styleId="Bezseznamu" w:default="1">
+    <w:name w:val="Bez seznamu"/>
     <w:uiPriority w:val="99"/>
     <w:semiHidden/>
     <w:unhideWhenUsed/>

</xml_diff>